<commit_message>
Revise implementation model and prompts
</commit_message>
<xml_diff>
--- a/docs/VIBE_CODING_PROMPTS.docx
+++ b/docs/VIBE_CODING_PROMPTS.docx
@@ -4,14 +4,9 @@
   <w:body>
     <w:p>
       <w:pPr>
-        <w:jc w:val="center"/>
+        <w:pStyle w:val="Heading1"/>
       </w:pPr>
       <w:r>
-        <w:rPr>
-          <w:b/>
-          <w:color w:val="0F766E"/>
-          <w:sz w:val="44"/>
-        </w:rPr>
         <w:t>바이브코딩 프롬프트 정리본</w:t>
       </w:r>
     </w:p>
@@ -21,8 +16,18 @@
       </w:pPr>
       <w:r>
         <w:t>목적</w:t>
-        <w:br/>
-        <w:t>이 문서는 구현 보고서 본문에서 분리한 바이브코딩 프롬프트 기록이다. 프롬프트는 단순히 “코드 작성”을 요청하는 방식이 아니라, 역할, 목표, 입력, 출력, 제약조건, 검증 기준을 단계별로 분리하여 실제 개발 산출물로 이어지도록 작성하였다.</w:t>
+      </w:r>
+    </w:p>
+    <w:p>
+      <w:pPr>
+        <w:spacing w:after="100"/>
+      </w:pPr>
+      <w:r>
+        <w:rPr>
+          <w:rFonts w:ascii="Arial" w:hAnsi="Arial" w:eastAsia="Noto Sans KR"/>
+          <w:sz w:val="20"/>
+        </w:rPr>
+        <w:t>이 문서는 구현 보고서 5번에서 분리한 바이브코딩 프롬프트 산출물이다. 실제 개발은 큰 기능을 한 번에 요청하는 방식이 아니라, 병원 블로그 생성기를 기능 모듈로 잘게 나누고 각 모듈마다 역할, 입력, 처리, 출력, 제약조건, 검증 기준을 명시하는 방식으로 진행하였다.</w:t>
       </w:r>
     </w:p>
     <w:p>
@@ -30,237 +35,2928 @@
         <w:pStyle w:val="Heading1"/>
       </w:pPr>
       <w:r>
-        <w:t>Prompt 1. 프로젝트 맥락 정의</w:t>
-        <w:br/>
-        <w:t>```text</w:t>
-        <w:br/>
-        <w:t>너는 Python과 Streamlit으로 서비스 프로토타입을 설계하는 시니어 개발자다.</w:t>
-        <w:br/>
-        <w:t>프로젝트 주제는 “개원의를 위한 병원 마케팅 블로그 생성기”이다.</w:t>
-        <w:br/>
-        <w:t>이 앱은 의료 진단이나 처방을 대신하지 않고, 병원 블로그 운영을 돕는 마케팅 보조 도구다.</w:t>
+        <w:t>프롬프트 작성 원칙</w:t>
       </w:r>
     </w:p>
-    <w:p>
-      <w:r>
-        <w:t>목표:</w:t>
-        <w:br/>
-        <w:t>1. 지역, 진료과, 증상 키워드를 입력받는다.</w:t>
-        <w:br/>
-        <w:t>2. 환자 눈높이에 맞는 병원 블로그 글 초안을 생성한다.</w:t>
-        <w:br/>
-        <w:t>3. 의사가 직접 설명하는 듯한 신뢰도 높은 문체를 적용한다.</w:t>
-        <w:br/>
-        <w:t>4. 의료광고상 위험한 표현을 줄인다.</w:t>
-        <w:br/>
-        <w:t>5. 키워드 검색량, 경쟁도, 포화지수, 등급을 분석한다.</w:t>
-        <w:br/>
-        <w:t>6. 썸네일과 워터마크까지 제작할 수 있게 한다.</w:t>
-      </w:r>
-    </w:p>
-    <w:p>
-      <w:r>
-        <w:t>제약:</w:t>
-        <w:br/>
-        <w:t>- 구현 언어는 Python을 중심으로 한다.</w:t>
-        <w:br/>
-        <w:t>- 웹 UI는 Streamlit을 사용한다.</w:t>
-        <w:br/>
-        <w:t>- API 키는 코드에 직접 노출하지 않는다.</w:t>
-        <w:br/>
-        <w:t>- 의료정보는 일반 안내이며 최종 검토는 의료진이 한다는 전제를 유지한다.</w:t>
-        <w:br/>
-        <w:t>```</w:t>
-      </w:r>
-    </w:p>
+    <w:tbl>
+      <w:tblPr>
+        <w:tblStyle w:val="TableGrid"/>
+        <w:tblW w:type="auto" w:w="0"/>
+        <w:jc w:val="center"/>
+        <w:tblLook w:firstColumn="1" w:firstRow="1" w:lastColumn="0" w:lastRow="0" w:noHBand="0" w:noVBand="1" w:val="04A0"/>
+      </w:tblPr>
+      <w:tblGrid>
+        <w:gridCol w:w="5083"/>
+        <w:gridCol w:w="5083"/>
+      </w:tblGrid>
+      <w:tr>
+        <w:tc>
+          <w:tcPr>
+            <w:tcW w:type="dxa" w:w="5083"/>
+            <w:vAlign w:val="center"/>
+            <w:shd w:fill="0F766E"/>
+          </w:tcPr>
+          <w:p>
+            <w:pPr>
+              <w:jc w:val="center"/>
+            </w:pPr>
+            <w:r/>
+            <w:r>
+              <w:rPr>
+                <w:rFonts w:ascii="Arial" w:hAnsi="Arial" w:eastAsia="Noto Sans KR"/>
+                <w:b/>
+                <w:color w:val="FFFFFF"/>
+                <w:sz w:val="17"/>
+              </w:rPr>
+              <w:t>원칙</w:t>
+            </w:r>
+          </w:p>
+        </w:tc>
+        <w:tc>
+          <w:tcPr>
+            <w:tcW w:type="dxa" w:w="5083"/>
+            <w:vAlign w:val="center"/>
+            <w:shd w:fill="0F766E"/>
+          </w:tcPr>
+          <w:p>
+            <w:pPr>
+              <w:jc w:val="center"/>
+            </w:pPr>
+            <w:r/>
+            <w:r>
+              <w:rPr>
+                <w:rFonts w:ascii="Arial" w:hAnsi="Arial" w:eastAsia="Noto Sans KR"/>
+                <w:b/>
+                <w:color w:val="FFFFFF"/>
+                <w:sz w:val="17"/>
+              </w:rPr>
+              <w:t>적용 방식</w:t>
+            </w:r>
+          </w:p>
+        </w:tc>
+      </w:tr>
+      <w:tr>
+        <w:tc>
+          <w:tcPr>
+            <w:tcW w:type="dxa" w:w="5083"/>
+            <w:vAlign w:val="center"/>
+          </w:tcPr>
+          <w:p>
+            <w:pPr>
+              <w:jc w:val="center"/>
+            </w:pPr>
+            <w:r/>
+            <w:r>
+              <w:rPr>
+                <w:rFonts w:ascii="Arial" w:hAnsi="Arial" w:eastAsia="Noto Sans KR"/>
+                <w:b w:val="0"/>
+                <w:sz w:val="17"/>
+              </w:rPr>
+              <w:t>기능별 분해</w:t>
+            </w:r>
+          </w:p>
+        </w:tc>
+        <w:tc>
+          <w:tcPr>
+            <w:tcW w:type="dxa" w:w="5083"/>
+            <w:vAlign w:val="center"/>
+          </w:tcPr>
+          <w:p>
+            <w:pPr>
+              <w:jc w:val="left"/>
+            </w:pPr>
+            <w:r/>
+            <w:r>
+              <w:rPr>
+                <w:rFonts w:ascii="Arial" w:hAnsi="Arial" w:eastAsia="Noto Sans KR"/>
+                <w:b w:val="0"/>
+                <w:sz w:val="17"/>
+              </w:rPr>
+              <w:t>콘텐츠 생성, 키워드 분석, 스타일/레퍼런스, 이미지/브랜딩, 저장/배포로 나누어 요청</w:t>
+            </w:r>
+          </w:p>
+        </w:tc>
+      </w:tr>
+      <w:tr>
+        <w:tc>
+          <w:tcPr>
+            <w:tcW w:type="dxa" w:w="5083"/>
+            <w:vAlign w:val="center"/>
+          </w:tcPr>
+          <w:p>
+            <w:pPr>
+              <w:jc w:val="center"/>
+            </w:pPr>
+            <w:r/>
+            <w:r>
+              <w:rPr>
+                <w:rFonts w:ascii="Arial" w:hAnsi="Arial" w:eastAsia="Noto Sans KR"/>
+                <w:b w:val="0"/>
+                <w:sz w:val="17"/>
+              </w:rPr>
+              <w:t>입력과 출력 고정</w:t>
+            </w:r>
+          </w:p>
+        </w:tc>
+        <w:tc>
+          <w:tcPr>
+            <w:tcW w:type="dxa" w:w="5083"/>
+            <w:vAlign w:val="center"/>
+          </w:tcPr>
+          <w:p>
+            <w:pPr>
+              <w:jc w:val="left"/>
+            </w:pPr>
+            <w:r/>
+            <w:r>
+              <w:rPr>
+                <w:rFonts w:ascii="Arial" w:hAnsi="Arial" w:eastAsia="Noto Sans KR"/>
+                <w:b w:val="0"/>
+                <w:sz w:val="17"/>
+              </w:rPr>
+              <w:t>각 프롬프트마다 사용자가 넣는 값과 화면에 표시될 결과를 먼저 정의</w:t>
+            </w:r>
+          </w:p>
+        </w:tc>
+      </w:tr>
+      <w:tr>
+        <w:tc>
+          <w:tcPr>
+            <w:tcW w:type="dxa" w:w="5083"/>
+            <w:vAlign w:val="center"/>
+          </w:tcPr>
+          <w:p>
+            <w:pPr>
+              <w:jc w:val="center"/>
+            </w:pPr>
+            <w:r/>
+            <w:r>
+              <w:rPr>
+                <w:rFonts w:ascii="Arial" w:hAnsi="Arial" w:eastAsia="Noto Sans KR"/>
+                <w:b w:val="0"/>
+                <w:sz w:val="17"/>
+              </w:rPr>
+              <w:t>Python 중심 구현</w:t>
+            </w:r>
+          </w:p>
+        </w:tc>
+        <w:tc>
+          <w:tcPr>
+            <w:tcW w:type="dxa" w:w="5083"/>
+            <w:vAlign w:val="center"/>
+          </w:tcPr>
+          <w:p>
+            <w:pPr>
+              <w:jc w:val="left"/>
+            </w:pPr>
+            <w:r/>
+            <w:r>
+              <w:rPr>
+                <w:rFonts w:ascii="Arial" w:hAnsi="Arial" w:eastAsia="Noto Sans KR"/>
+                <w:b w:val="0"/>
+                <w:sz w:val="17"/>
+              </w:rPr>
+              <w:t>Streamlit 화면, Python 모듈, DB/API 연동을 기준으로 코드 요청</w:t>
+            </w:r>
+          </w:p>
+        </w:tc>
+      </w:tr>
+      <w:tr>
+        <w:tc>
+          <w:tcPr>
+            <w:tcW w:type="dxa" w:w="5083"/>
+            <w:vAlign w:val="center"/>
+          </w:tcPr>
+          <w:p>
+            <w:pPr>
+              <w:jc w:val="center"/>
+            </w:pPr>
+            <w:r/>
+            <w:r>
+              <w:rPr>
+                <w:rFonts w:ascii="Arial" w:hAnsi="Arial" w:eastAsia="Noto Sans KR"/>
+                <w:b w:val="0"/>
+                <w:sz w:val="17"/>
+              </w:rPr>
+              <w:t>의료광고 안전성</w:t>
+            </w:r>
+          </w:p>
+        </w:tc>
+        <w:tc>
+          <w:tcPr>
+            <w:tcW w:type="dxa" w:w="5083"/>
+            <w:vAlign w:val="center"/>
+          </w:tcPr>
+          <w:p>
+            <w:pPr>
+              <w:jc w:val="left"/>
+            </w:pPr>
+            <w:r/>
+            <w:r>
+              <w:rPr>
+                <w:rFonts w:ascii="Arial" w:hAnsi="Arial" w:eastAsia="Noto Sans KR"/>
+                <w:b w:val="0"/>
+                <w:sz w:val="17"/>
+              </w:rPr>
+              <w:t>진단·치료 보장 표현을 피하고 의료진 최종 검토 전제를 포함</w:t>
+            </w:r>
+          </w:p>
+        </w:tc>
+      </w:tr>
+      <w:tr>
+        <w:tc>
+          <w:tcPr>
+            <w:tcW w:type="dxa" w:w="5083"/>
+            <w:vAlign w:val="center"/>
+          </w:tcPr>
+          <w:p>
+            <w:pPr>
+              <w:jc w:val="center"/>
+            </w:pPr>
+            <w:r/>
+            <w:r>
+              <w:rPr>
+                <w:rFonts w:ascii="Arial" w:hAnsi="Arial" w:eastAsia="Noto Sans KR"/>
+                <w:b w:val="0"/>
+                <w:sz w:val="17"/>
+              </w:rPr>
+              <w:t>검증 가능성</w:t>
+            </w:r>
+          </w:p>
+        </w:tc>
+        <w:tc>
+          <w:tcPr>
+            <w:tcW w:type="dxa" w:w="5083"/>
+            <w:vAlign w:val="center"/>
+          </w:tcPr>
+          <w:p>
+            <w:pPr>
+              <w:jc w:val="left"/>
+            </w:pPr>
+            <w:r/>
+            <w:r>
+              <w:rPr>
+                <w:rFonts w:ascii="Arial" w:hAnsi="Arial" w:eastAsia="Noto Sans KR"/>
+                <w:b w:val="0"/>
+                <w:sz w:val="17"/>
+              </w:rPr>
+              <w:t>구현 후 테스트 시나리오와 실패 조건을 함께 요청</w:t>
+            </w:r>
+          </w:p>
+        </w:tc>
+      </w:tr>
+    </w:tbl>
+    <w:p/>
     <w:p>
       <w:pPr>
         <w:pStyle w:val="Heading1"/>
       </w:pPr>
       <w:r>
-        <w:t>Prompt 2. 기능 요구사항 도출</w:t>
-        <w:br/>
-        <w:t>```text</w:t>
-        <w:br/>
-        <w:t>위 프로젝트를 실제 제품 기획서처럼 기능군별 요구사항으로 나누어줘.</w:t>
-        <w:br/>
-        <w:t>기능군은 콘텐츠 생성, 키워드 분석, 신뢰도 관리, 이미지/브랜딩, 데이터 관리, 배포/운영, 안전성으로 구분해줘.</w:t>
-        <w:br/>
-        <w:t>각 요구사항은 ID, 기능군, 요구사항명, 상세 설명, 우선순위로 표를 만들어줘.</w:t>
-        <w:br/>
-        <w:t>특히 키워드 등급, 포화지수, 스마트블록, 썸네일 제작, 워터마크 기능이 빠지지 않게 해줘.</w:t>
-        <w:br/>
-        <w:t>```</w:t>
+        <w:t>P-01. 전체 아키텍처 프롬프트</w:t>
       </w:r>
     </w:p>
+    <w:tbl>
+      <w:tblPr>
+        <w:tblStyle w:val="TableGrid"/>
+        <w:tblW w:type="auto" w:w="0"/>
+        <w:tblLook w:firstColumn="1" w:firstRow="1" w:lastColumn="0" w:lastRow="0" w:noHBand="0" w:noVBand="1" w:val="04A0"/>
+      </w:tblPr>
+      <w:tblGrid>
+        <w:gridCol w:w="10166"/>
+      </w:tblGrid>
+      <w:tr>
+        <w:tc>
+          <w:tcPr>
+            <w:tcW w:type="dxa" w:w="10166"/>
+            <w:shd w:fill="F1F5F9"/>
+          </w:tcPr>
+          <w:p>
+            <w:r/>
+          </w:p>
+          <w:p>
+            <w:r>
+              <w:rPr>
+                <w:rFonts w:ascii="Courier New" w:hAnsi="Courier New" w:eastAsia="Noto Sans KR"/>
+                <w:color w:val="0F172A"/>
+                <w:sz w:val="16"/>
+              </w:rPr>
+              <w:t>너는 Python/Streamlit 기반 서비스 프로토타입을 설계하는 개발자다.</w:t>
+            </w:r>
+          </w:p>
+          <w:p>
+            <w:r>
+              <w:rPr>
+                <w:rFonts w:ascii="Courier New" w:hAnsi="Courier New" w:eastAsia="Noto Sans KR"/>
+                <w:color w:val="0F172A"/>
+                <w:sz w:val="16"/>
+              </w:rPr>
+              <w:t>프로젝트는 “개원의를 위한 병원 마케팅 블로그 생성기”이다.</w:t>
+            </w:r>
+          </w:p>
+          <w:p>
+            <w:r>
+              <w:rPr>
+                <w:rFonts w:ascii="Courier New" w:hAnsi="Courier New" w:eastAsia="Noto Sans KR"/>
+                <w:color w:val="0F172A"/>
+                <w:sz w:val="16"/>
+              </w:rPr>
+              <w:t>목표는 개원의가 직접 작성하는 느낌의 신뢰도 높은 블로그 글을 만들고, 키워드 분석·썸네일·워터마크까지 한 흐름에서 처리하는 것이다.</w:t>
+            </w:r>
+          </w:p>
+          <w:p>
+            <w:r>
+              <w:rPr>
+                <w:rFonts w:ascii="Courier New" w:hAnsi="Courier New" w:eastAsia="Noto Sans KR"/>
+                <w:color w:val="0F172A"/>
+                <w:sz w:val="16"/>
+              </w:rPr>
+            </w:r>
+          </w:p>
+          <w:p>
+            <w:r>
+              <w:rPr>
+                <w:rFonts w:ascii="Courier New" w:hAnsi="Courier New" w:eastAsia="Noto Sans KR"/>
+                <w:color w:val="0F172A"/>
+                <w:sz w:val="16"/>
+              </w:rPr>
+              <w:t>필수 조건:</w:t>
+            </w:r>
+          </w:p>
+          <w:p>
+            <w:r>
+              <w:rPr>
+                <w:rFonts w:ascii="Courier New" w:hAnsi="Courier New" w:eastAsia="Noto Sans KR"/>
+                <w:color w:val="0F172A"/>
+                <w:sz w:val="16"/>
+              </w:rPr>
+              <w:t>1. 구현 언어는 Python 중심으로 한다.</w:t>
+            </w:r>
+          </w:p>
+          <w:p>
+            <w:r>
+              <w:rPr>
+                <w:rFonts w:ascii="Courier New" w:hAnsi="Courier New" w:eastAsia="Noto Sans KR"/>
+                <w:color w:val="0F172A"/>
+                <w:sz w:val="16"/>
+              </w:rPr>
+              <w:t>2. UI는 Streamlit으로 구성한다.</w:t>
+            </w:r>
+          </w:p>
+          <w:p>
+            <w:r>
+              <w:rPr>
+                <w:rFonts w:ascii="Courier New" w:hAnsi="Courier New" w:eastAsia="Noto Sans KR"/>
+                <w:color w:val="0F172A"/>
+                <w:sz w:val="16"/>
+              </w:rPr>
+              <w:t>3. 기능은 app.py, pages/, src/naverblog/, scripts/로 분리한다.</w:t>
+            </w:r>
+          </w:p>
+          <w:p>
+            <w:r>
+              <w:rPr>
+                <w:rFonts w:ascii="Courier New" w:hAnsi="Courier New" w:eastAsia="Noto Sans KR"/>
+                <w:color w:val="0F172A"/>
+                <w:sz w:val="16"/>
+              </w:rPr>
+              <w:t>4. API 키는 코드에 직접 넣지 않고 환경변수 또는 Streamlit Secrets로 처리한다.</w:t>
+            </w:r>
+          </w:p>
+          <w:p>
+            <w:r>
+              <w:rPr>
+                <w:rFonts w:ascii="Courier New" w:hAnsi="Courier New" w:eastAsia="Noto Sans KR"/>
+                <w:color w:val="0F172A"/>
+                <w:sz w:val="16"/>
+              </w:rPr>
+              <w:t>5. 의료정보는 일반 안내이며 최종 발행 전 의료진 검토가 필요하다는 전제를 유지한다.</w:t>
+            </w:r>
+          </w:p>
+          <w:p>
+            <w:r>
+              <w:rPr>
+                <w:rFonts w:ascii="Courier New" w:hAnsi="Courier New" w:eastAsia="Noto Sans KR"/>
+                <w:color w:val="0F172A"/>
+                <w:sz w:val="16"/>
+              </w:rPr>
+            </w:r>
+          </w:p>
+          <w:p>
+            <w:r>
+              <w:rPr>
+                <w:rFonts w:ascii="Courier New" w:hAnsi="Courier New" w:eastAsia="Noto Sans KR"/>
+                <w:color w:val="0F172A"/>
+                <w:sz w:val="16"/>
+              </w:rPr>
+              <w:t>출력:</w:t>
+            </w:r>
+          </w:p>
+          <w:p>
+            <w:r>
+              <w:rPr>
+                <w:rFonts w:ascii="Courier New" w:hAnsi="Courier New" w:eastAsia="Noto Sans KR"/>
+                <w:color w:val="0F172A"/>
+                <w:sz w:val="16"/>
+              </w:rPr>
+              <w:t>- 전체 폴더 구조</w:t>
+            </w:r>
+          </w:p>
+          <w:p>
+            <w:r>
+              <w:rPr>
+                <w:rFonts w:ascii="Courier New" w:hAnsi="Courier New" w:eastAsia="Noto Sans KR"/>
+                <w:color w:val="0F172A"/>
+                <w:sz w:val="16"/>
+              </w:rPr>
+              <w:t>- 각 파일의 책임</w:t>
+            </w:r>
+          </w:p>
+          <w:p>
+            <w:r>
+              <w:rPr>
+                <w:rFonts w:ascii="Courier New" w:hAnsi="Courier New" w:eastAsia="Noto Sans KR"/>
+                <w:color w:val="0F172A"/>
+                <w:sz w:val="16"/>
+              </w:rPr>
+              <w:t>- 입력→처리→출력 데이터 흐름</w:t>
+            </w:r>
+          </w:p>
+          <w:p>
+            <w:r>
+              <w:rPr>
+                <w:rFonts w:ascii="Courier New" w:hAnsi="Courier New" w:eastAsia="Noto Sans KR"/>
+                <w:color w:val="0F172A"/>
+                <w:sz w:val="16"/>
+              </w:rPr>
+              <w:t>- 먼저 구현할 MVP 기능과 나중에 확장할 기능 구분</w:t>
+            </w:r>
+          </w:p>
+        </w:tc>
+      </w:tr>
+    </w:tbl>
+    <w:p/>
     <w:p>
       <w:pPr>
         <w:pStyle w:val="Heading1"/>
       </w:pPr>
       <w:r>
-        <w:t>Prompt 3. 화면 설계 요청</w:t>
-        <w:br/>
-        <w:t>```text</w:t>
-        <w:br/>
-        <w:t>Streamlit 앱 기준으로 화면 설계서를 작성해줘.</w:t>
-        <w:br/>
-        <w:t>필요 화면:</w:t>
-        <w:br/>
-        <w:t>1. 메인 글 생성 화면</w:t>
-        <w:br/>
-        <w:t>2. 키워드 분석 화면</w:t>
-        <w:br/>
-        <w:t>3. 스타일 가이드 편집 화면</w:t>
-        <w:br/>
-        <w:t>4. 레퍼런스 글 관리 화면</w:t>
-        <w:br/>
-        <w:t>5. 썸네일 제작 화면</w:t>
-        <w:br/>
-        <w:t>6. 워터마크 화면</w:t>
+        <w:t>P-02. 콘텐츠 생성 모듈 프롬프트</w:t>
       </w:r>
     </w:p>
-    <w:p>
-      <w:r>
-        <w:t>각 화면마다 입력 항목, 처리 내용, 출력 결과, 사용자가 기대하는 행동을 표로 정리해줘.</w:t>
-        <w:br/>
-        <w:t>```</w:t>
-      </w:r>
-    </w:p>
+    <w:tbl>
+      <w:tblPr>
+        <w:tblStyle w:val="TableGrid"/>
+        <w:tblW w:type="auto" w:w="0"/>
+        <w:tblLook w:firstColumn="1" w:firstRow="1" w:lastColumn="0" w:lastRow="0" w:noHBand="0" w:noVBand="1" w:val="04A0"/>
+      </w:tblPr>
+      <w:tblGrid>
+        <w:gridCol w:w="10166"/>
+      </w:tblGrid>
+      <w:tr>
+        <w:tc>
+          <w:tcPr>
+            <w:tcW w:type="dxa" w:w="10166"/>
+            <w:shd w:fill="F1F5F9"/>
+          </w:tcPr>
+          <w:p>
+            <w:r/>
+          </w:p>
+          <w:p>
+            <w:r>
+              <w:rPr>
+                <w:rFonts w:ascii="Courier New" w:hAnsi="Courier New" w:eastAsia="Noto Sans KR"/>
+                <w:color w:val="0F172A"/>
+                <w:sz w:val="16"/>
+              </w:rPr>
+              <w:t>병원 블로그 글 생성 모듈을 설계하고 Python/Streamlit 코드 구조를 제안해줘.</w:t>
+            </w:r>
+          </w:p>
+          <w:p>
+            <w:r>
+              <w:rPr>
+                <w:rFonts w:ascii="Courier New" w:hAnsi="Courier New" w:eastAsia="Noto Sans KR"/>
+                <w:color w:val="0F172A"/>
+                <w:sz w:val="16"/>
+              </w:rPr>
+            </w:r>
+          </w:p>
+          <w:p>
+            <w:r>
+              <w:rPr>
+                <w:rFonts w:ascii="Courier New" w:hAnsi="Courier New" w:eastAsia="Noto Sans KR"/>
+                <w:color w:val="0F172A"/>
+                <w:sz w:val="16"/>
+              </w:rPr>
+              <w:t>입력:</w:t>
+            </w:r>
+          </w:p>
+          <w:p>
+            <w:r>
+              <w:rPr>
+                <w:rFonts w:ascii="Courier New" w:hAnsi="Courier New" w:eastAsia="Noto Sans KR"/>
+                <w:color w:val="0F172A"/>
+                <w:sz w:val="16"/>
+              </w:rPr>
+              <w:t>- 진료과</w:t>
+            </w:r>
+          </w:p>
+          <w:p>
+            <w:r>
+              <w:rPr>
+                <w:rFonts w:ascii="Courier New" w:hAnsi="Courier New" w:eastAsia="Noto Sans KR"/>
+                <w:color w:val="0F172A"/>
+                <w:sz w:val="16"/>
+              </w:rPr>
+              <w:t>- 지역명</w:t>
+            </w:r>
+          </w:p>
+          <w:p>
+            <w:r>
+              <w:rPr>
+                <w:rFonts w:ascii="Courier New" w:hAnsi="Courier New" w:eastAsia="Noto Sans KR"/>
+                <w:color w:val="0F172A"/>
+                <w:sz w:val="16"/>
+              </w:rPr>
+              <w:t>- 증상 또는 검사 키워드</w:t>
+            </w:r>
+          </w:p>
+          <w:p>
+            <w:r>
+              <w:rPr>
+                <w:rFonts w:ascii="Courier New" w:hAnsi="Courier New" w:eastAsia="Noto Sans KR"/>
+                <w:color w:val="0F172A"/>
+                <w:sz w:val="16"/>
+              </w:rPr>
+              <w:t>- 카테고리 프리셋</w:t>
+            </w:r>
+          </w:p>
+          <w:p>
+            <w:r>
+              <w:rPr>
+                <w:rFonts w:ascii="Courier New" w:hAnsi="Courier New" w:eastAsia="Noto Sans KR"/>
+                <w:color w:val="0F172A"/>
+                <w:sz w:val="16"/>
+              </w:rPr>
+              <w:t>- 페르소나</w:t>
+            </w:r>
+          </w:p>
+          <w:p>
+            <w:r>
+              <w:rPr>
+                <w:rFonts w:ascii="Courier New" w:hAnsi="Courier New" w:eastAsia="Noto Sans KR"/>
+                <w:color w:val="0F172A"/>
+                <w:sz w:val="16"/>
+              </w:rPr>
+              <w:t>- 글 유형</w:t>
+            </w:r>
+          </w:p>
+          <w:p>
+            <w:r>
+              <w:rPr>
+                <w:rFonts w:ascii="Courier New" w:hAnsi="Courier New" w:eastAsia="Noto Sans KR"/>
+                <w:color w:val="0F172A"/>
+                <w:sz w:val="16"/>
+              </w:rPr>
+              <w:t>- 의사가 직접 강조하고 싶은 코멘트</w:t>
+            </w:r>
+          </w:p>
+          <w:p>
+            <w:r>
+              <w:rPr>
+                <w:rFonts w:ascii="Courier New" w:hAnsi="Courier New" w:eastAsia="Noto Sans KR"/>
+                <w:color w:val="0F172A"/>
+                <w:sz w:val="16"/>
+              </w:rPr>
+            </w:r>
+          </w:p>
+          <w:p>
+            <w:r>
+              <w:rPr>
+                <w:rFonts w:ascii="Courier New" w:hAnsi="Courier New" w:eastAsia="Noto Sans KR"/>
+                <w:color w:val="0F172A"/>
+                <w:sz w:val="16"/>
+              </w:rPr>
+              <w:t>처리:</w:t>
+            </w:r>
+          </w:p>
+          <w:p>
+            <w:r>
+              <w:rPr>
+                <w:rFonts w:ascii="Courier New" w:hAnsi="Courier New" w:eastAsia="Noto Sans KR"/>
+                <w:color w:val="0F172A"/>
+                <w:sz w:val="16"/>
+              </w:rPr>
+              <w:t>1. 입력값을 정리하여 프롬프트 변수로 만든다.</w:t>
+            </w:r>
+          </w:p>
+          <w:p>
+            <w:r>
+              <w:rPr>
+                <w:rFonts w:ascii="Courier New" w:hAnsi="Courier New" w:eastAsia="Noto Sans KR"/>
+                <w:color w:val="0F172A"/>
+                <w:sz w:val="16"/>
+              </w:rPr>
+              <w:t>2. 병원 스타일 가이드와 레퍼런스 글을 함께 반영한다.</w:t>
+            </w:r>
+          </w:p>
+          <w:p>
+            <w:r>
+              <w:rPr>
+                <w:rFonts w:ascii="Courier New" w:hAnsi="Courier New" w:eastAsia="Noto Sans KR"/>
+                <w:color w:val="0F172A"/>
+                <w:sz w:val="16"/>
+              </w:rPr>
+              <w:t>3. 환자 눈높이의 정보형 글 구조로 Markdown 초안을 생성한다.</w:t>
+            </w:r>
+          </w:p>
+          <w:p>
+            <w:r>
+              <w:rPr>
+                <w:rFonts w:ascii="Courier New" w:hAnsi="Courier New" w:eastAsia="Noto Sans KR"/>
+                <w:color w:val="0F172A"/>
+                <w:sz w:val="16"/>
+              </w:rPr>
+              <w:t>4. 네이버블로그에 붙여넣기 쉬운 HTML로 변환한다.</w:t>
+            </w:r>
+          </w:p>
+          <w:p>
+            <w:r>
+              <w:rPr>
+                <w:rFonts w:ascii="Courier New" w:hAnsi="Courier New" w:eastAsia="Noto Sans KR"/>
+                <w:color w:val="0F172A"/>
+                <w:sz w:val="16"/>
+              </w:rPr>
+              <w:t>5. 본문 중간에 이미지 삽입 위치 마커를 표시한다.</w:t>
+            </w:r>
+          </w:p>
+          <w:p>
+            <w:r>
+              <w:rPr>
+                <w:rFonts w:ascii="Courier New" w:hAnsi="Courier New" w:eastAsia="Noto Sans KR"/>
+                <w:color w:val="0F172A"/>
+                <w:sz w:val="16"/>
+              </w:rPr>
+            </w:r>
+          </w:p>
+          <w:p>
+            <w:r>
+              <w:rPr>
+                <w:rFonts w:ascii="Courier New" w:hAnsi="Courier New" w:eastAsia="Noto Sans KR"/>
+                <w:color w:val="0F172A"/>
+                <w:sz w:val="16"/>
+              </w:rPr>
+              <w:t>출력:</w:t>
+            </w:r>
+          </w:p>
+          <w:p>
+            <w:r>
+              <w:rPr>
+                <w:rFonts w:ascii="Courier New" w:hAnsi="Courier New" w:eastAsia="Noto Sans KR"/>
+                <w:color w:val="0F172A"/>
+                <w:sz w:val="16"/>
+              </w:rPr>
+              <w:t>- 제목 후보</w:t>
+            </w:r>
+          </w:p>
+          <w:p>
+            <w:r>
+              <w:rPr>
+                <w:rFonts w:ascii="Courier New" w:hAnsi="Courier New" w:eastAsia="Noto Sans KR"/>
+                <w:color w:val="0F172A"/>
+                <w:sz w:val="16"/>
+              </w:rPr>
+              <w:t>- Markdown 본문</w:t>
+            </w:r>
+          </w:p>
+          <w:p>
+            <w:r>
+              <w:rPr>
+                <w:rFonts w:ascii="Courier New" w:hAnsi="Courier New" w:eastAsia="Noto Sans KR"/>
+                <w:color w:val="0F172A"/>
+                <w:sz w:val="16"/>
+              </w:rPr>
+              <w:t>- HTML 본문</w:t>
+            </w:r>
+          </w:p>
+          <w:p>
+            <w:r>
+              <w:rPr>
+                <w:rFonts w:ascii="Courier New" w:hAnsi="Courier New" w:eastAsia="Noto Sans KR"/>
+                <w:color w:val="0F172A"/>
+                <w:sz w:val="16"/>
+              </w:rPr>
+              <w:t>- 이미지 삽입 위치</w:t>
+            </w:r>
+          </w:p>
+          <w:p>
+            <w:r>
+              <w:rPr>
+                <w:rFonts w:ascii="Courier New" w:hAnsi="Courier New" w:eastAsia="Noto Sans KR"/>
+                <w:color w:val="0F172A"/>
+                <w:sz w:val="16"/>
+              </w:rPr>
+              <w:t>- 의료진 검토 안내 문구</w:t>
+            </w:r>
+          </w:p>
+          <w:p>
+            <w:r>
+              <w:rPr>
+                <w:rFonts w:ascii="Courier New" w:hAnsi="Courier New" w:eastAsia="Noto Sans KR"/>
+                <w:color w:val="0F172A"/>
+                <w:sz w:val="16"/>
+              </w:rPr>
+            </w:r>
+          </w:p>
+          <w:p>
+            <w:r>
+              <w:rPr>
+                <w:rFonts w:ascii="Courier New" w:hAnsi="Courier New" w:eastAsia="Noto Sans KR"/>
+                <w:color w:val="0F172A"/>
+                <w:sz w:val="16"/>
+              </w:rPr>
+              <w:t>주의:</w:t>
+            </w:r>
+          </w:p>
+          <w:p>
+            <w:r>
+              <w:rPr>
+                <w:rFonts w:ascii="Courier New" w:hAnsi="Courier New" w:eastAsia="Noto Sans KR"/>
+                <w:color w:val="0F172A"/>
+                <w:sz w:val="16"/>
+              </w:rPr>
+              <w:t>- 완치 보장, 100% 효과, 부작용 없음 같은 표현은 사용하지 않는다.</w:t>
+            </w:r>
+          </w:p>
+          <w:p>
+            <w:r>
+              <w:rPr>
+                <w:rFonts w:ascii="Courier New" w:hAnsi="Courier New" w:eastAsia="Noto Sans KR"/>
+                <w:color w:val="0F172A"/>
+                <w:sz w:val="16"/>
+              </w:rPr>
+              <w:t>- 병원 홍보보다 환자가 이해할 수 있는 설명형 문체를 우선한다.</w:t>
+            </w:r>
+          </w:p>
+        </w:tc>
+      </w:tr>
+    </w:tbl>
+    <w:p/>
     <w:p>
       <w:pPr>
         <w:pStyle w:val="Heading1"/>
       </w:pPr>
       <w:r>
-        <w:t>Prompt 4. Python/Streamlit 구현 구조 설계</w:t>
-        <w:br/>
-        <w:t>```text</w:t>
-        <w:br/>
-        <w:t>기능을 Python 파일 구조로 나누어줘.</w:t>
-        <w:br/>
-        <w:t>현재 구조는 app.py, pages 폴더, src/naverblog 폴더, scripts 폴더로 구성한다.</w:t>
-        <w:br/>
-        <w:t>각 파일이 담당할 책임을 정리하고, 모듈 간 데이터 흐름을 설명해줘.</w:t>
-        <w:br/>
-        <w:t>```</w:t>
+        <w:t>P-03. 프롬프트 파이프라인 모듈 프롬프트</w:t>
       </w:r>
     </w:p>
+    <w:tbl>
+      <w:tblPr>
+        <w:tblStyle w:val="TableGrid"/>
+        <w:tblW w:type="auto" w:w="0"/>
+        <w:tblLook w:firstColumn="1" w:firstRow="1" w:lastColumn="0" w:lastRow="0" w:noHBand="0" w:noVBand="1" w:val="04A0"/>
+      </w:tblPr>
+      <w:tblGrid>
+        <w:gridCol w:w="10166"/>
+      </w:tblGrid>
+      <w:tr>
+        <w:tc>
+          <w:tcPr>
+            <w:tcW w:type="dxa" w:w="10166"/>
+            <w:shd w:fill="F1F5F9"/>
+          </w:tcPr>
+          <w:p>
+            <w:r/>
+          </w:p>
+          <w:p>
+            <w:r>
+              <w:rPr>
+                <w:rFonts w:ascii="Courier New" w:hAnsi="Courier New" w:eastAsia="Noto Sans KR"/>
+                <w:color w:val="0F172A"/>
+                <w:sz w:val="16"/>
+              </w:rPr>
+              <w:t>src/naverblog/pipeline.py 역할을 설계해줘.</w:t>
+            </w:r>
+          </w:p>
+          <w:p>
+            <w:r>
+              <w:rPr>
+                <w:rFonts w:ascii="Courier New" w:hAnsi="Courier New" w:eastAsia="Noto Sans KR"/>
+                <w:color w:val="0F172A"/>
+                <w:sz w:val="16"/>
+              </w:rPr>
+            </w:r>
+          </w:p>
+          <w:p>
+            <w:r>
+              <w:rPr>
+                <w:rFonts w:ascii="Courier New" w:hAnsi="Courier New" w:eastAsia="Noto Sans KR"/>
+                <w:color w:val="0F172A"/>
+                <w:sz w:val="16"/>
+              </w:rPr>
+              <w:t>요구사항:</w:t>
+            </w:r>
+          </w:p>
+          <w:p>
+            <w:r>
+              <w:rPr>
+                <w:rFonts w:ascii="Courier New" w:hAnsi="Courier New" w:eastAsia="Noto Sans KR"/>
+                <w:color w:val="0F172A"/>
+                <w:sz w:val="16"/>
+              </w:rPr>
+              <w:t>1. 검색 스킬, 키워드 스킬, 스타일 스킬, 레퍼런스 스킬을 순서대로 실행한다.</w:t>
+            </w:r>
+          </w:p>
+          <w:p>
+            <w:r>
+              <w:rPr>
+                <w:rFonts w:ascii="Courier New" w:hAnsi="Courier New" w:eastAsia="Noto Sans KR"/>
+                <w:color w:val="0F172A"/>
+                <w:sz w:val="16"/>
+              </w:rPr>
+              <w:t>2. 각 스킬의 결과를 하나의 context 객체로 모은다.</w:t>
+            </w:r>
+          </w:p>
+          <w:p>
+            <w:r>
+              <w:rPr>
+                <w:rFonts w:ascii="Courier New" w:hAnsi="Courier New" w:eastAsia="Noto Sans KR"/>
+                <w:color w:val="0F172A"/>
+                <w:sz w:val="16"/>
+              </w:rPr>
+              <w:t>3. Jinja2 템플릿을 사용해 최종 LLM 프롬프트를 조립한다.</w:t>
+            </w:r>
+          </w:p>
+          <w:p>
+            <w:r>
+              <w:rPr>
+                <w:rFonts w:ascii="Courier New" w:hAnsi="Courier New" w:eastAsia="Noto Sans KR"/>
+                <w:color w:val="0F172A"/>
+                <w:sz w:val="16"/>
+              </w:rPr>
+              <w:t>4. LiteLLM을 통해 선택한 모델에 요청한다.</w:t>
+            </w:r>
+          </w:p>
+          <w:p>
+            <w:r>
+              <w:rPr>
+                <w:rFonts w:ascii="Courier New" w:hAnsi="Courier New" w:eastAsia="Noto Sans KR"/>
+                <w:color w:val="0F172A"/>
+                <w:sz w:val="16"/>
+              </w:rPr>
+              <w:t>5. 생성 결과를 Markdown과 HTML로 분리해 반환한다.</w:t>
+            </w:r>
+          </w:p>
+          <w:p>
+            <w:r>
+              <w:rPr>
+                <w:rFonts w:ascii="Courier New" w:hAnsi="Courier New" w:eastAsia="Noto Sans KR"/>
+                <w:color w:val="0F172A"/>
+                <w:sz w:val="16"/>
+              </w:rPr>
+              <w:t>6. prompt_used와 output을 DB에 저장할 수 있도록 Generation 모델에 맞춘다.</w:t>
+            </w:r>
+          </w:p>
+          <w:p>
+            <w:r>
+              <w:rPr>
+                <w:rFonts w:ascii="Courier New" w:hAnsi="Courier New" w:eastAsia="Noto Sans KR"/>
+                <w:color w:val="0F172A"/>
+                <w:sz w:val="16"/>
+              </w:rPr>
+            </w:r>
+          </w:p>
+          <w:p>
+            <w:r>
+              <w:rPr>
+                <w:rFonts w:ascii="Courier New" w:hAnsi="Courier New" w:eastAsia="Noto Sans KR"/>
+                <w:color w:val="0F172A"/>
+                <w:sz w:val="16"/>
+              </w:rPr>
+              <w:t>검증:</w:t>
+            </w:r>
+          </w:p>
+          <w:p>
+            <w:r>
+              <w:rPr>
+                <w:rFonts w:ascii="Courier New" w:hAnsi="Courier New" w:eastAsia="Noto Sans KR"/>
+                <w:color w:val="0F172A"/>
+                <w:sz w:val="16"/>
+              </w:rPr>
+              <w:t>- 스킬이 비활성화되어도 기본 글 생성은 동작해야 한다.</w:t>
+            </w:r>
+          </w:p>
+          <w:p>
+            <w:r>
+              <w:rPr>
+                <w:rFonts w:ascii="Courier New" w:hAnsi="Courier New" w:eastAsia="Noto Sans KR"/>
+                <w:color w:val="0F172A"/>
+                <w:sz w:val="16"/>
+              </w:rPr>
+              <w:t>- LLM 호출 실패 시 사용자에게 원인을 알 수 있는 오류 메시지를 보여줘야 한다.</w:t>
+            </w:r>
+          </w:p>
+        </w:tc>
+      </w:tr>
+    </w:tbl>
+    <w:p/>
     <w:p>
       <w:pPr>
         <w:pStyle w:val="Heading1"/>
       </w:pPr>
       <w:r>
-        <w:t>Prompt 5. 키워드 분석 기능 구현 방향</w:t>
-        <w:br/>
-        <w:t>```text</w:t>
-        <w:br/>
-        <w:t>네이버 블로그 마케팅용 키워드 분석 기능을 설계해줘.</w:t>
-        <w:br/>
-        <w:t>필수 지표:</w:t>
-        <w:br/>
-        <w:t>- 월간 PC/모바일 검색량</w:t>
-        <w:br/>
-        <w:t>- 경쟁도</w:t>
-        <w:br/>
-        <w:t>- 블로그 발행수</w:t>
-        <w:br/>
-        <w:t>- 카페 발행수</w:t>
-        <w:br/>
-        <w:t>- 콘텐츠 포화지수</w:t>
-        <w:br/>
-        <w:t>- 키워드 등급 S/A/B/C/D</w:t>
-        <w:br/>
-        <w:t>- 연관 키워드</w:t>
-        <w:br/>
-        <w:t>- 주제 클러스터</w:t>
-        <w:br/>
-        <w:t>- 해시태그</w:t>
-        <w:br/>
-        <w:t>- 검색 트렌드</w:t>
-        <w:br/>
-        <w:t>- 성별/연령대 인구통계</w:t>
-        <w:br/>
-        <w:t>- 스마트블록 구성</w:t>
+        <w:t>P-04. 키워드 분석 모듈 프롬프트</w:t>
       </w:r>
     </w:p>
-    <w:p>
-      <w:r>
-        <w:t>각 지표가 병원 블로그 글 발행 전략에 어떻게 쓰이는지도 설명해줘.</w:t>
-        <w:br/>
-        <w:t>```</w:t>
-      </w:r>
-    </w:p>
+    <w:tbl>
+      <w:tblPr>
+        <w:tblStyle w:val="TableGrid"/>
+        <w:tblW w:type="auto" w:w="0"/>
+        <w:tblLook w:firstColumn="1" w:firstRow="1" w:lastColumn="0" w:lastRow="0" w:noHBand="0" w:noVBand="1" w:val="04A0"/>
+      </w:tblPr>
+      <w:tblGrid>
+        <w:gridCol w:w="10166"/>
+      </w:tblGrid>
+      <w:tr>
+        <w:tc>
+          <w:tcPr>
+            <w:tcW w:type="dxa" w:w="10166"/>
+            <w:shd w:fill="F1F5F9"/>
+          </w:tcPr>
+          <w:p>
+            <w:r/>
+          </w:p>
+          <w:p>
+            <w:r>
+              <w:rPr>
+                <w:rFonts w:ascii="Courier New" w:hAnsi="Courier New" w:eastAsia="Noto Sans KR"/>
+                <w:color w:val="0F172A"/>
+                <w:sz w:val="16"/>
+              </w:rPr>
+              <w:t>병원 블로그 발행 전략을 위한 키워드 분석 모듈을 구현해줘.</w:t>
+            </w:r>
+          </w:p>
+          <w:p>
+            <w:r>
+              <w:rPr>
+                <w:rFonts w:ascii="Courier New" w:hAnsi="Courier New" w:eastAsia="Noto Sans KR"/>
+                <w:color w:val="0F172A"/>
+                <w:sz w:val="16"/>
+              </w:rPr>
+            </w:r>
+          </w:p>
+          <w:p>
+            <w:r>
+              <w:rPr>
+                <w:rFonts w:ascii="Courier New" w:hAnsi="Courier New" w:eastAsia="Noto Sans KR"/>
+                <w:color w:val="0F172A"/>
+                <w:sz w:val="16"/>
+              </w:rPr>
+              <w:t>입력:</w:t>
+            </w:r>
+          </w:p>
+          <w:p>
+            <w:r>
+              <w:rPr>
+                <w:rFonts w:ascii="Courier New" w:hAnsi="Courier New" w:eastAsia="Noto Sans KR"/>
+                <w:color w:val="0F172A"/>
+                <w:sz w:val="16"/>
+              </w:rPr>
+              <w:t>- 기준 키워드 1개</w:t>
+            </w:r>
+          </w:p>
+          <w:p>
+            <w:r>
+              <w:rPr>
+                <w:rFonts w:ascii="Courier New" w:hAnsi="Courier New" w:eastAsia="Noto Sans KR"/>
+                <w:color w:val="0F172A"/>
+                <w:sz w:val="16"/>
+              </w:rPr>
+              <w:t>- 비교 키워드 여러 개</w:t>
+            </w:r>
+          </w:p>
+          <w:p>
+            <w:r>
+              <w:rPr>
+                <w:rFonts w:ascii="Courier New" w:hAnsi="Courier New" w:eastAsia="Noto Sans KR"/>
+                <w:color w:val="0F172A"/>
+                <w:sz w:val="16"/>
+              </w:rPr>
+              <w:t>- 분석 기간</w:t>
+            </w:r>
+          </w:p>
+          <w:p>
+            <w:r>
+              <w:rPr>
+                <w:rFonts w:ascii="Courier New" w:hAnsi="Courier New" w:eastAsia="Noto Sans KR"/>
+                <w:color w:val="0F172A"/>
+                <w:sz w:val="16"/>
+              </w:rPr>
+              <w:t>- 기기, 성별, 연령대 옵션</w:t>
+            </w:r>
+          </w:p>
+          <w:p>
+            <w:r>
+              <w:rPr>
+                <w:rFonts w:ascii="Courier New" w:hAnsi="Courier New" w:eastAsia="Noto Sans KR"/>
+                <w:color w:val="0F172A"/>
+                <w:sz w:val="16"/>
+              </w:rPr>
+            </w:r>
+          </w:p>
+          <w:p>
+            <w:r>
+              <w:rPr>
+                <w:rFonts w:ascii="Courier New" w:hAnsi="Courier New" w:eastAsia="Noto Sans KR"/>
+                <w:color w:val="0F172A"/>
+                <w:sz w:val="16"/>
+              </w:rPr>
+              <w:t>필수 지표:</w:t>
+            </w:r>
+          </w:p>
+          <w:p>
+            <w:r>
+              <w:rPr>
+                <w:rFonts w:ascii="Courier New" w:hAnsi="Courier New" w:eastAsia="Noto Sans KR"/>
+                <w:color w:val="0F172A"/>
+                <w:sz w:val="16"/>
+              </w:rPr>
+              <w:t>1. 월간 PC 검색량</w:t>
+            </w:r>
+          </w:p>
+          <w:p>
+            <w:r>
+              <w:rPr>
+                <w:rFonts w:ascii="Courier New" w:hAnsi="Courier New" w:eastAsia="Noto Sans KR"/>
+                <w:color w:val="0F172A"/>
+                <w:sz w:val="16"/>
+              </w:rPr>
+              <w:t>2. 월간 모바일 검색량</w:t>
+            </w:r>
+          </w:p>
+          <w:p>
+            <w:r>
+              <w:rPr>
+                <w:rFonts w:ascii="Courier New" w:hAnsi="Courier New" w:eastAsia="Noto Sans KR"/>
+                <w:color w:val="0F172A"/>
+                <w:sz w:val="16"/>
+              </w:rPr>
+              <w:t>3. 총 검색량</w:t>
+            </w:r>
+          </w:p>
+          <w:p>
+            <w:r>
+              <w:rPr>
+                <w:rFonts w:ascii="Courier New" w:hAnsi="Courier New" w:eastAsia="Noto Sans KR"/>
+                <w:color w:val="0F172A"/>
+                <w:sz w:val="16"/>
+              </w:rPr>
+              <w:t>4. 경쟁도</w:t>
+            </w:r>
+          </w:p>
+          <w:p>
+            <w:r>
+              <w:rPr>
+                <w:rFonts w:ascii="Courier New" w:hAnsi="Courier New" w:eastAsia="Noto Sans KR"/>
+                <w:color w:val="0F172A"/>
+                <w:sz w:val="16"/>
+              </w:rPr>
+              <w:t>5. 블로그 발행수</w:t>
+            </w:r>
+          </w:p>
+          <w:p>
+            <w:r>
+              <w:rPr>
+                <w:rFonts w:ascii="Courier New" w:hAnsi="Courier New" w:eastAsia="Noto Sans KR"/>
+                <w:color w:val="0F172A"/>
+                <w:sz w:val="16"/>
+              </w:rPr>
+              <w:t>6. 카페 발행수</w:t>
+            </w:r>
+          </w:p>
+          <w:p>
+            <w:r>
+              <w:rPr>
+                <w:rFonts w:ascii="Courier New" w:hAnsi="Courier New" w:eastAsia="Noto Sans KR"/>
+                <w:color w:val="0F172A"/>
+                <w:sz w:val="16"/>
+              </w:rPr>
+              <w:t>7. 콘텐츠 포화지수</w:t>
+            </w:r>
+          </w:p>
+          <w:p>
+            <w:r>
+              <w:rPr>
+                <w:rFonts w:ascii="Courier New" w:hAnsi="Courier New" w:eastAsia="Noto Sans KR"/>
+                <w:color w:val="0F172A"/>
+                <w:sz w:val="16"/>
+              </w:rPr>
+              <w:t>8. 키워드 등급 S/A/B/C/D</w:t>
+            </w:r>
+          </w:p>
+          <w:p>
+            <w:r>
+              <w:rPr>
+                <w:rFonts w:ascii="Courier New" w:hAnsi="Courier New" w:eastAsia="Noto Sans KR"/>
+                <w:color w:val="0F172A"/>
+                <w:sz w:val="16"/>
+              </w:rPr>
+              <w:t>9. 연관 키워드</w:t>
+            </w:r>
+          </w:p>
+          <w:p>
+            <w:r>
+              <w:rPr>
+                <w:rFonts w:ascii="Courier New" w:hAnsi="Courier New" w:eastAsia="Noto Sans KR"/>
+                <w:color w:val="0F172A"/>
+                <w:sz w:val="16"/>
+              </w:rPr>
+              <w:t>10. 주제 클러스터</w:t>
+            </w:r>
+          </w:p>
+          <w:p>
+            <w:r>
+              <w:rPr>
+                <w:rFonts w:ascii="Courier New" w:hAnsi="Courier New" w:eastAsia="Noto Sans KR"/>
+                <w:color w:val="0F172A"/>
+                <w:sz w:val="16"/>
+              </w:rPr>
+              <w:t>11. 해시태그</w:t>
+            </w:r>
+          </w:p>
+          <w:p>
+            <w:r>
+              <w:rPr>
+                <w:rFonts w:ascii="Courier New" w:hAnsi="Courier New" w:eastAsia="Noto Sans KR"/>
+                <w:color w:val="0F172A"/>
+                <w:sz w:val="16"/>
+              </w:rPr>
+              <w:t>12. 검색 트렌드</w:t>
+            </w:r>
+          </w:p>
+          <w:p>
+            <w:r>
+              <w:rPr>
+                <w:rFonts w:ascii="Courier New" w:hAnsi="Courier New" w:eastAsia="Noto Sans KR"/>
+                <w:color w:val="0F172A"/>
+                <w:sz w:val="16"/>
+              </w:rPr>
+              <w:t>13. 성별/연령대 인구통계</w:t>
+            </w:r>
+          </w:p>
+          <w:p>
+            <w:r>
+              <w:rPr>
+                <w:rFonts w:ascii="Courier New" w:hAnsi="Courier New" w:eastAsia="Noto Sans KR"/>
+                <w:color w:val="0F172A"/>
+                <w:sz w:val="16"/>
+              </w:rPr>
+              <w:t>14. 스마트블록 구성</w:t>
+            </w:r>
+          </w:p>
+          <w:p>
+            <w:r>
+              <w:rPr>
+                <w:rFonts w:ascii="Courier New" w:hAnsi="Courier New" w:eastAsia="Noto Sans KR"/>
+                <w:color w:val="0F172A"/>
+                <w:sz w:val="16"/>
+              </w:rPr>
+            </w:r>
+          </w:p>
+          <w:p>
+            <w:r>
+              <w:rPr>
+                <w:rFonts w:ascii="Courier New" w:hAnsi="Courier New" w:eastAsia="Noto Sans KR"/>
+                <w:color w:val="0F172A"/>
+                <w:sz w:val="16"/>
+              </w:rPr>
+              <w:t>출력 화면:</w:t>
+            </w:r>
+          </w:p>
+          <w:p>
+            <w:r>
+              <w:rPr>
+                <w:rFonts w:ascii="Courier New" w:hAnsi="Courier New" w:eastAsia="Noto Sans KR"/>
+                <w:color w:val="0F172A"/>
+                <w:sz w:val="16"/>
+              </w:rPr>
+              <w:t>- 핵심 지표 카드</w:t>
+            </w:r>
+          </w:p>
+          <w:p>
+            <w:r>
+              <w:rPr>
+                <w:rFonts w:ascii="Courier New" w:hAnsi="Courier New" w:eastAsia="Noto Sans KR"/>
+                <w:color w:val="0F172A"/>
+                <w:sz w:val="16"/>
+              </w:rPr>
+              <w:t>- 키워드 등급 배지</w:t>
+            </w:r>
+          </w:p>
+          <w:p>
+            <w:r>
+              <w:rPr>
+                <w:rFonts w:ascii="Courier New" w:hAnsi="Courier New" w:eastAsia="Noto Sans KR"/>
+                <w:color w:val="0F172A"/>
+                <w:sz w:val="16"/>
+              </w:rPr>
+              <w:t>- 비교 표</w:t>
+            </w:r>
+          </w:p>
+          <w:p>
+            <w:r>
+              <w:rPr>
+                <w:rFonts w:ascii="Courier New" w:hAnsi="Courier New" w:eastAsia="Noto Sans KR"/>
+                <w:color w:val="0F172A"/>
+                <w:sz w:val="16"/>
+              </w:rPr>
+              <w:t>- 트렌드 그래프</w:t>
+            </w:r>
+          </w:p>
+          <w:p>
+            <w:r>
+              <w:rPr>
+                <w:rFonts w:ascii="Courier New" w:hAnsi="Courier New" w:eastAsia="Noto Sans KR"/>
+                <w:color w:val="0F172A"/>
+                <w:sz w:val="16"/>
+              </w:rPr>
+              <w:t>- 스마트블록 분석 결과</w:t>
+            </w:r>
+          </w:p>
+          <w:p>
+            <w:r>
+              <w:rPr>
+                <w:rFonts w:ascii="Courier New" w:hAnsi="Courier New" w:eastAsia="Noto Sans KR"/>
+                <w:color w:val="0F172A"/>
+                <w:sz w:val="16"/>
+              </w:rPr>
+              <w:t>- CSV 다운로드</w:t>
+            </w:r>
+          </w:p>
+          <w:p>
+            <w:r>
+              <w:rPr>
+                <w:rFonts w:ascii="Courier New" w:hAnsi="Courier New" w:eastAsia="Noto Sans KR"/>
+                <w:color w:val="0F172A"/>
+                <w:sz w:val="16"/>
+              </w:rPr>
+            </w:r>
+          </w:p>
+          <w:p>
+            <w:r>
+              <w:rPr>
+                <w:rFonts w:ascii="Courier New" w:hAnsi="Courier New" w:eastAsia="Noto Sans KR"/>
+                <w:color w:val="0F172A"/>
+                <w:sz w:val="16"/>
+              </w:rPr>
+              <w:t>판단 기준:</w:t>
+            </w:r>
+          </w:p>
+          <w:p>
+            <w:r>
+              <w:rPr>
+                <w:rFonts w:ascii="Courier New" w:hAnsi="Courier New" w:eastAsia="Noto Sans KR"/>
+                <w:color w:val="0F172A"/>
+                <w:sz w:val="16"/>
+              </w:rPr>
+              <w:t>- 검색량은 높고 포화지수가 낮은 키워드를 우선 추천한다.</w:t>
+            </w:r>
+          </w:p>
+          <w:p>
+            <w:r>
+              <w:rPr>
+                <w:rFonts w:ascii="Courier New" w:hAnsi="Courier New" w:eastAsia="Noto Sans KR"/>
+                <w:color w:val="0F172A"/>
+                <w:sz w:val="16"/>
+              </w:rPr>
+              <w:t>- 경쟁도가 지나치게 높은 키워드는 대체 키워드를 함께 제안한다.</w:t>
+            </w:r>
+          </w:p>
+        </w:tc>
+      </w:tr>
+    </w:tbl>
+    <w:p/>
     <w:p>
       <w:pPr>
         <w:pStyle w:val="Heading1"/>
       </w:pPr>
       <w:r>
-        <w:t>Prompt 6. 의료광고 표현 점검 로직</w:t>
-        <w:br/>
-        <w:t>```text</w:t>
-        <w:br/>
-        <w:t>병원 블로그 글에서 의료광고상 위험할 수 있는 표현을 점검하는 Python 로직을 작성해줘.</w:t>
-        <w:br/>
-        <w:t>위험 표현 예시는 완치, 100%, 부작용 없음, 최고, 유일, 무조건이다.</w:t>
-        <w:br/>
-        <w:t>각 표현이 왜 위험한지와 어떤 표현으로 바꾸면 좋은지 함께 출력해줘.</w:t>
-        <w:br/>
-        <w:t>결과는 리스트 형태로 반환하고, 화면에는 표현/이유/대체 방향으로 보여줘.</w:t>
-        <w:br/>
-        <w:t>```</w:t>
+        <w:t>P-05. 스타일 가이드·레퍼런스 관리 프롬프트</w:t>
       </w:r>
     </w:p>
+    <w:tbl>
+      <w:tblPr>
+        <w:tblStyle w:val="TableGrid"/>
+        <w:tblW w:type="auto" w:w="0"/>
+        <w:tblLook w:firstColumn="1" w:firstRow="1" w:lastColumn="0" w:lastRow="0" w:noHBand="0" w:noVBand="1" w:val="04A0"/>
+      </w:tblPr>
+      <w:tblGrid>
+        <w:gridCol w:w="10166"/>
+      </w:tblGrid>
+      <w:tr>
+        <w:tc>
+          <w:tcPr>
+            <w:tcW w:type="dxa" w:w="10166"/>
+            <w:shd w:fill="F1F5F9"/>
+          </w:tcPr>
+          <w:p>
+            <w:r/>
+          </w:p>
+          <w:p>
+            <w:r>
+              <w:rPr>
+                <w:rFonts w:ascii="Courier New" w:hAnsi="Courier New" w:eastAsia="Noto Sans KR"/>
+                <w:color w:val="0F172A"/>
+                <w:sz w:val="16"/>
+              </w:rPr>
+              <w:t>병원 블로그가 대행사 글처럼 보이지 않도록 스타일 가이드와 레퍼런스 글 관리 기능을 만들어줘.</w:t>
+            </w:r>
+          </w:p>
+          <w:p>
+            <w:r>
+              <w:rPr>
+                <w:rFonts w:ascii="Courier New" w:hAnsi="Courier New" w:eastAsia="Noto Sans KR"/>
+                <w:color w:val="0F172A"/>
+                <w:sz w:val="16"/>
+              </w:rPr>
+            </w:r>
+          </w:p>
+          <w:p>
+            <w:r>
+              <w:rPr>
+                <w:rFonts w:ascii="Courier New" w:hAnsi="Courier New" w:eastAsia="Noto Sans KR"/>
+                <w:color w:val="0F172A"/>
+                <w:sz w:val="16"/>
+              </w:rPr>
+              <w:t>스타일 가이드 기능:</w:t>
+            </w:r>
+          </w:p>
+          <w:p>
+            <w:r>
+              <w:rPr>
+                <w:rFonts w:ascii="Courier New" w:hAnsi="Courier New" w:eastAsia="Noto Sans KR"/>
+                <w:color w:val="0F172A"/>
+                <w:sz w:val="16"/>
+              </w:rPr>
+              <w:t>- 공통 글쓰기 원칙 편집</w:t>
+            </w:r>
+          </w:p>
+          <w:p>
+            <w:r>
+              <w:rPr>
+                <w:rFonts w:ascii="Courier New" w:hAnsi="Courier New" w:eastAsia="Noto Sans KR"/>
+                <w:color w:val="0F172A"/>
+                <w:sz w:val="16"/>
+              </w:rPr>
+              <w:t>- 카테고리별 문체 편집</w:t>
+            </w:r>
+          </w:p>
+          <w:p>
+            <w:r>
+              <w:rPr>
+                <w:rFonts w:ascii="Courier New" w:hAnsi="Courier New" w:eastAsia="Noto Sans KR"/>
+                <w:color w:val="0F172A"/>
+                <w:sz w:val="16"/>
+              </w:rPr>
+              <w:t>- 새 카테고리 추가</w:t>
+            </w:r>
+          </w:p>
+          <w:p>
+            <w:r>
+              <w:rPr>
+                <w:rFonts w:ascii="Courier New" w:hAnsi="Courier New" w:eastAsia="Noto Sans KR"/>
+                <w:color w:val="0F172A"/>
+                <w:sz w:val="16"/>
+              </w:rPr>
+              <w:t>- 저장 후 글 생성 프롬프트에 자동 반영</w:t>
+            </w:r>
+          </w:p>
+          <w:p>
+            <w:r>
+              <w:rPr>
+                <w:rFonts w:ascii="Courier New" w:hAnsi="Courier New" w:eastAsia="Noto Sans KR"/>
+                <w:color w:val="0F172A"/>
+                <w:sz w:val="16"/>
+              </w:rPr>
+            </w:r>
+          </w:p>
+          <w:p>
+            <w:r>
+              <w:rPr>
+                <w:rFonts w:ascii="Courier New" w:hAnsi="Courier New" w:eastAsia="Noto Sans KR"/>
+                <w:color w:val="0F172A"/>
+                <w:sz w:val="16"/>
+              </w:rPr>
+              <w:t>레퍼런스 글 기능:</w:t>
+            </w:r>
+          </w:p>
+          <w:p>
+            <w:r>
+              <w:rPr>
+                <w:rFonts w:ascii="Courier New" w:hAnsi="Courier New" w:eastAsia="Noto Sans KR"/>
+                <w:color w:val="0F172A"/>
+                <w:sz w:val="16"/>
+              </w:rPr>
+              <w:t>- 제목, 카테고리, 본문, 링크 저장</w:t>
+            </w:r>
+          </w:p>
+          <w:p>
+            <w:r>
+              <w:rPr>
+                <w:rFonts w:ascii="Courier New" w:hAnsi="Courier New" w:eastAsia="Noto Sans KR"/>
+                <w:color w:val="0F172A"/>
+                <w:sz w:val="16"/>
+              </w:rPr>
+              <w:t>- 기존 글 목록 표시</w:t>
+            </w:r>
+          </w:p>
+          <w:p>
+            <w:r>
+              <w:rPr>
+                <w:rFonts w:ascii="Courier New" w:hAnsi="Courier New" w:eastAsia="Noto Sans KR"/>
+                <w:color w:val="0F172A"/>
+                <w:sz w:val="16"/>
+              </w:rPr>
+              <w:t>- 수정/삭제 가능</w:t>
+            </w:r>
+          </w:p>
+          <w:p>
+            <w:r>
+              <w:rPr>
+                <w:rFonts w:ascii="Courier New" w:hAnsi="Courier New" w:eastAsia="Noto Sans KR"/>
+                <w:color w:val="0F172A"/>
+                <w:sz w:val="16"/>
+              </w:rPr>
+              <w:t>- 새 글 생성 시 관련 레퍼런스를 요약해 context로 전달</w:t>
+            </w:r>
+          </w:p>
+          <w:p>
+            <w:r>
+              <w:rPr>
+                <w:rFonts w:ascii="Courier New" w:hAnsi="Courier New" w:eastAsia="Noto Sans KR"/>
+                <w:color w:val="0F172A"/>
+                <w:sz w:val="16"/>
+              </w:rPr>
+            </w:r>
+          </w:p>
+          <w:p>
+            <w:r>
+              <w:rPr>
+                <w:rFonts w:ascii="Courier New" w:hAnsi="Courier New" w:eastAsia="Noto Sans KR"/>
+                <w:color w:val="0F172A"/>
+                <w:sz w:val="16"/>
+              </w:rPr>
+              <w:t>출력:</w:t>
+            </w:r>
+          </w:p>
+          <w:p>
+            <w:r>
+              <w:rPr>
+                <w:rFonts w:ascii="Courier New" w:hAnsi="Courier New" w:eastAsia="Noto Sans KR"/>
+                <w:color w:val="0F172A"/>
+                <w:sz w:val="16"/>
+              </w:rPr>
+              <w:t>- 병원 고유 문체 규칙</w:t>
+            </w:r>
+          </w:p>
+          <w:p>
+            <w:r>
+              <w:rPr>
+                <w:rFonts w:ascii="Courier New" w:hAnsi="Courier New" w:eastAsia="Noto Sans KR"/>
+                <w:color w:val="0F172A"/>
+                <w:sz w:val="16"/>
+              </w:rPr>
+              <w:t>- 참고 글 요약</w:t>
+            </w:r>
+          </w:p>
+          <w:p>
+            <w:r>
+              <w:rPr>
+                <w:rFonts w:ascii="Courier New" w:hAnsi="Courier New" w:eastAsia="Noto Sans KR"/>
+                <w:color w:val="0F172A"/>
+                <w:sz w:val="16"/>
+              </w:rPr>
+              <w:t>- 생성 프롬프트에 삽입할 reference_context</w:t>
+            </w:r>
+          </w:p>
+        </w:tc>
+      </w:tr>
+    </w:tbl>
+    <w:p/>
     <w:p>
       <w:pPr>
         <w:pStyle w:val="Heading1"/>
       </w:pPr>
       <w:r>
-        <w:t>Prompt 7. 썸네일 제작 기능 설계</w:t>
-        <w:br/>
-        <w:t>```text</w:t>
-        <w:br/>
-        <w:t>병원 블로그용 썸네일 제작 화면을 설계해줘.</w:t>
-        <w:br/>
-        <w:t>기능은 텍스트 입력, 제목/부제목 편집, 색상 선택, 배경 이미지 업로드, 정렬, 글자 크기 조절, 다운로드를 포함해줘.</w:t>
-        <w:br/>
-        <w:t>UI는 사용자가 미리캔버스처럼 직관적으로 조작할 수 있게 구성해줘.</w:t>
-        <w:br/>
-        <w:t>```</w:t>
+        <w:t>P-06. 의료광고 안전성 점검 프롬프트</w:t>
       </w:r>
     </w:p>
+    <w:tbl>
+      <w:tblPr>
+        <w:tblStyle w:val="TableGrid"/>
+        <w:tblW w:type="auto" w:w="0"/>
+        <w:tblLook w:firstColumn="1" w:firstRow="1" w:lastColumn="0" w:lastRow="0" w:noHBand="0" w:noVBand="1" w:val="04A0"/>
+      </w:tblPr>
+      <w:tblGrid>
+        <w:gridCol w:w="10166"/>
+      </w:tblGrid>
+      <w:tr>
+        <w:tc>
+          <w:tcPr>
+            <w:tcW w:type="dxa" w:w="10166"/>
+            <w:shd w:fill="F1F5F9"/>
+          </w:tcPr>
+          <w:p>
+            <w:r/>
+          </w:p>
+          <w:p>
+            <w:r>
+              <w:rPr>
+                <w:rFonts w:ascii="Courier New" w:hAnsi="Courier New" w:eastAsia="Noto Sans KR"/>
+                <w:color w:val="0F172A"/>
+                <w:sz w:val="16"/>
+              </w:rPr>
+              <w:t>병원 블로그 글에서 의료광고상 위험할 수 있는 표현을 점검하는 Python 로직을 작성해줘.</w:t>
+            </w:r>
+          </w:p>
+          <w:p>
+            <w:r>
+              <w:rPr>
+                <w:rFonts w:ascii="Courier New" w:hAnsi="Courier New" w:eastAsia="Noto Sans KR"/>
+                <w:color w:val="0F172A"/>
+                <w:sz w:val="16"/>
+              </w:rPr>
+            </w:r>
+          </w:p>
+          <w:p>
+            <w:r>
+              <w:rPr>
+                <w:rFonts w:ascii="Courier New" w:hAnsi="Courier New" w:eastAsia="Noto Sans KR"/>
+                <w:color w:val="0F172A"/>
+                <w:sz w:val="16"/>
+              </w:rPr>
+              <w:t>위험 표현 예시:</w:t>
+            </w:r>
+          </w:p>
+          <w:p>
+            <w:r>
+              <w:rPr>
+                <w:rFonts w:ascii="Courier New" w:hAnsi="Courier New" w:eastAsia="Noto Sans KR"/>
+                <w:color w:val="0F172A"/>
+                <w:sz w:val="16"/>
+              </w:rPr>
+              <w:t>- 완치</w:t>
+            </w:r>
+          </w:p>
+          <w:p>
+            <w:r>
+              <w:rPr>
+                <w:rFonts w:ascii="Courier New" w:hAnsi="Courier New" w:eastAsia="Noto Sans KR"/>
+                <w:color w:val="0F172A"/>
+                <w:sz w:val="16"/>
+              </w:rPr>
+              <w:t>- 100% 효과</w:t>
+            </w:r>
+          </w:p>
+          <w:p>
+            <w:r>
+              <w:rPr>
+                <w:rFonts w:ascii="Courier New" w:hAnsi="Courier New" w:eastAsia="Noto Sans KR"/>
+                <w:color w:val="0F172A"/>
+                <w:sz w:val="16"/>
+              </w:rPr>
+              <w:t>- 부작용 없음</w:t>
+            </w:r>
+          </w:p>
+          <w:p>
+            <w:r>
+              <w:rPr>
+                <w:rFonts w:ascii="Courier New" w:hAnsi="Courier New" w:eastAsia="Noto Sans KR"/>
+                <w:color w:val="0F172A"/>
+                <w:sz w:val="16"/>
+              </w:rPr>
+              <w:t>- 최고</w:t>
+            </w:r>
+          </w:p>
+          <w:p>
+            <w:r>
+              <w:rPr>
+                <w:rFonts w:ascii="Courier New" w:hAnsi="Courier New" w:eastAsia="Noto Sans KR"/>
+                <w:color w:val="0F172A"/>
+                <w:sz w:val="16"/>
+              </w:rPr>
+              <w:t>- 유일</w:t>
+            </w:r>
+          </w:p>
+          <w:p>
+            <w:r>
+              <w:rPr>
+                <w:rFonts w:ascii="Courier New" w:hAnsi="Courier New" w:eastAsia="Noto Sans KR"/>
+                <w:color w:val="0F172A"/>
+                <w:sz w:val="16"/>
+              </w:rPr>
+              <w:t>- 무조건</w:t>
+            </w:r>
+          </w:p>
+          <w:p>
+            <w:r>
+              <w:rPr>
+                <w:rFonts w:ascii="Courier New" w:hAnsi="Courier New" w:eastAsia="Noto Sans KR"/>
+                <w:color w:val="0F172A"/>
+                <w:sz w:val="16"/>
+              </w:rPr>
+              <w:t>- 보장</w:t>
+            </w:r>
+          </w:p>
+          <w:p>
+            <w:r>
+              <w:rPr>
+                <w:rFonts w:ascii="Courier New" w:hAnsi="Courier New" w:eastAsia="Noto Sans KR"/>
+                <w:color w:val="0F172A"/>
+                <w:sz w:val="16"/>
+              </w:rPr>
+              <w:t>- 즉시 치료</w:t>
+            </w:r>
+          </w:p>
+          <w:p>
+            <w:r>
+              <w:rPr>
+                <w:rFonts w:ascii="Courier New" w:hAnsi="Courier New" w:eastAsia="Noto Sans KR"/>
+                <w:color w:val="0F172A"/>
+                <w:sz w:val="16"/>
+              </w:rPr>
+            </w:r>
+          </w:p>
+          <w:p>
+            <w:r>
+              <w:rPr>
+                <w:rFonts w:ascii="Courier New" w:hAnsi="Courier New" w:eastAsia="Noto Sans KR"/>
+                <w:color w:val="0F172A"/>
+                <w:sz w:val="16"/>
+              </w:rPr>
+              <w:t>출력 형식:</w:t>
+            </w:r>
+          </w:p>
+          <w:p>
+            <w:r>
+              <w:rPr>
+                <w:rFonts w:ascii="Courier New" w:hAnsi="Courier New" w:eastAsia="Noto Sans KR"/>
+                <w:color w:val="0F172A"/>
+                <w:sz w:val="16"/>
+              </w:rPr>
+              <w:t>- 발견 표현</w:t>
+            </w:r>
+          </w:p>
+          <w:p>
+            <w:r>
+              <w:rPr>
+                <w:rFonts w:ascii="Courier New" w:hAnsi="Courier New" w:eastAsia="Noto Sans KR"/>
+                <w:color w:val="0F172A"/>
+                <w:sz w:val="16"/>
+              </w:rPr>
+              <w:t>- 위험 이유</w:t>
+            </w:r>
+          </w:p>
+          <w:p>
+            <w:r>
+              <w:rPr>
+                <w:rFonts w:ascii="Courier New" w:hAnsi="Courier New" w:eastAsia="Noto Sans KR"/>
+                <w:color w:val="0F172A"/>
+                <w:sz w:val="16"/>
+              </w:rPr>
+              <w:t>- 대체 표현 방향</w:t>
+            </w:r>
+          </w:p>
+          <w:p>
+            <w:r>
+              <w:rPr>
+                <w:rFonts w:ascii="Courier New" w:hAnsi="Courier New" w:eastAsia="Noto Sans KR"/>
+                <w:color w:val="0F172A"/>
+                <w:sz w:val="16"/>
+              </w:rPr>
+              <w:t>- 수정 예시</w:t>
+            </w:r>
+          </w:p>
+          <w:p>
+            <w:r>
+              <w:rPr>
+                <w:rFonts w:ascii="Courier New" w:hAnsi="Courier New" w:eastAsia="Noto Sans KR"/>
+                <w:color w:val="0F172A"/>
+                <w:sz w:val="16"/>
+              </w:rPr>
+            </w:r>
+          </w:p>
+          <w:p>
+            <w:r>
+              <w:rPr>
+                <w:rFonts w:ascii="Courier New" w:hAnsi="Courier New" w:eastAsia="Noto Sans KR"/>
+                <w:color w:val="0F172A"/>
+                <w:sz w:val="16"/>
+              </w:rPr>
+              <w:t>화면 표시:</w:t>
+            </w:r>
+          </w:p>
+          <w:p>
+            <w:r>
+              <w:rPr>
+                <w:rFonts w:ascii="Courier New" w:hAnsi="Courier New" w:eastAsia="Noto Sans KR"/>
+                <w:color w:val="0F172A"/>
+                <w:sz w:val="16"/>
+              </w:rPr>
+              <w:t>- 위험 표현이 있으면 경고 카드로 보여준다.</w:t>
+            </w:r>
+          </w:p>
+          <w:p>
+            <w:r>
+              <w:rPr>
+                <w:rFonts w:ascii="Courier New" w:hAnsi="Courier New" w:eastAsia="Noto Sans KR"/>
+                <w:color w:val="0F172A"/>
+                <w:sz w:val="16"/>
+              </w:rPr>
+              <w:t>- 위험 표현이 없으면 “의료진 최종 검토 필요” 안내와 함께 통과 상태를 보여준다.</w:t>
+            </w:r>
+          </w:p>
+        </w:tc>
+      </w:tr>
+    </w:tbl>
+    <w:p/>
     <w:p>
       <w:pPr>
         <w:pStyle w:val="Heading1"/>
       </w:pPr>
       <w:r>
-        <w:t>Prompt 8. 구현 후 검증 요청</w:t>
-        <w:br/>
-        <w:t>```text</w:t>
-        <w:br/>
-        <w:t>구현된 Python/Streamlit 프로젝트를 검토해줘.</w:t>
-        <w:br/>
-        <w:t>확인할 항목:</w:t>
-        <w:br/>
-        <w:t>1. 문법 오류가 없는가</w:t>
-        <w:br/>
-        <w:t>2. 주요 페이지가 import 가능한가</w:t>
-        <w:br/>
-        <w:t>3. 의료광고 위험 표현 점검이 동작하는가</w:t>
-        <w:br/>
-        <w:t>4. 키워드 분석 결과가 캐시될 수 있는가</w:t>
-        <w:br/>
-        <w:t>5. 썸네일/워터마크 기능이 파일 출력까지 이어지는가</w:t>
-        <w:br/>
-        <w:t>6. 배포 시 API 키가 코드에 노출되지 않는가</w:t>
-        <w:br/>
-        <w:t>검증 결과를 테스트 시나리오 표로 정리해줘.</w:t>
-        <w:br/>
-        <w:t>```</w:t>
-        <w:br/>
+        <w:t>P-07. 이미지 생성·본문 배치 프롬프트</w:t>
       </w:r>
     </w:p>
+    <w:tbl>
+      <w:tblPr>
+        <w:tblStyle w:val="TableGrid"/>
+        <w:tblW w:type="auto" w:w="0"/>
+        <w:tblLook w:firstColumn="1" w:firstRow="1" w:lastColumn="0" w:lastRow="0" w:noHBand="0" w:noVBand="1" w:val="04A0"/>
+      </w:tblPr>
+      <w:tblGrid>
+        <w:gridCol w:w="10166"/>
+      </w:tblGrid>
+      <w:tr>
+        <w:tc>
+          <w:tcPr>
+            <w:tcW w:type="dxa" w:w="10166"/>
+            <w:shd w:fill="F1F5F9"/>
+          </w:tcPr>
+          <w:p>
+            <w:r/>
+          </w:p>
+          <w:p>
+            <w:r>
+              <w:rPr>
+                <w:rFonts w:ascii="Courier New" w:hAnsi="Courier New" w:eastAsia="Noto Sans KR"/>
+                <w:color w:val="0F172A"/>
+                <w:sz w:val="16"/>
+              </w:rPr>
+              <w:t>블로그 글 주제에 맞는 이미지 생성과 본문 배치 기능을 설계해줘.</w:t>
+            </w:r>
+          </w:p>
+          <w:p>
+            <w:r>
+              <w:rPr>
+                <w:rFonts w:ascii="Courier New" w:hAnsi="Courier New" w:eastAsia="Noto Sans KR"/>
+                <w:color w:val="0F172A"/>
+                <w:sz w:val="16"/>
+              </w:rPr>
+            </w:r>
+          </w:p>
+          <w:p>
+            <w:r>
+              <w:rPr>
+                <w:rFonts w:ascii="Courier New" w:hAnsi="Courier New" w:eastAsia="Noto Sans KR"/>
+                <w:color w:val="0F172A"/>
+                <w:sz w:val="16"/>
+              </w:rPr>
+              <w:t>입력:</w:t>
+            </w:r>
+          </w:p>
+          <w:p>
+            <w:r>
+              <w:rPr>
+                <w:rFonts w:ascii="Courier New" w:hAnsi="Courier New" w:eastAsia="Noto Sans KR"/>
+                <w:color w:val="0F172A"/>
+                <w:sz w:val="16"/>
+              </w:rPr>
+              <w:t>- 글 주제</w:t>
+            </w:r>
+          </w:p>
+          <w:p>
+            <w:r>
+              <w:rPr>
+                <w:rFonts w:ascii="Courier New" w:hAnsi="Courier New" w:eastAsia="Noto Sans KR"/>
+                <w:color w:val="0F172A"/>
+                <w:sz w:val="16"/>
+              </w:rPr>
+              <w:t>- 진료과</w:t>
+            </w:r>
+          </w:p>
+          <w:p>
+            <w:r>
+              <w:rPr>
+                <w:rFonts w:ascii="Courier New" w:hAnsi="Courier New" w:eastAsia="Noto Sans KR"/>
+                <w:color w:val="0F172A"/>
+                <w:sz w:val="16"/>
+              </w:rPr>
+              <w:t>- 원하는 이미지 톤</w:t>
+            </w:r>
+          </w:p>
+          <w:p>
+            <w:r>
+              <w:rPr>
+                <w:rFonts w:ascii="Courier New" w:hAnsi="Courier New" w:eastAsia="Noto Sans KR"/>
+                <w:color w:val="0F172A"/>
+                <w:sz w:val="16"/>
+              </w:rPr>
+              <w:t>- 업로드 이미지 목록</w:t>
+            </w:r>
+          </w:p>
+          <w:p>
+            <w:r>
+              <w:rPr>
+                <w:rFonts w:ascii="Courier New" w:hAnsi="Courier New" w:eastAsia="Noto Sans KR"/>
+                <w:color w:val="0F172A"/>
+                <w:sz w:val="16"/>
+              </w:rPr>
+            </w:r>
+          </w:p>
+          <w:p>
+            <w:r>
+              <w:rPr>
+                <w:rFonts w:ascii="Courier New" w:hAnsi="Courier New" w:eastAsia="Noto Sans KR"/>
+                <w:color w:val="0F172A"/>
+                <w:sz w:val="16"/>
+              </w:rPr>
+              <w:t>처리:</w:t>
+            </w:r>
+          </w:p>
+          <w:p>
+            <w:r>
+              <w:rPr>
+                <w:rFonts w:ascii="Courier New" w:hAnsi="Courier New" w:eastAsia="Noto Sans KR"/>
+                <w:color w:val="0F172A"/>
+                <w:sz w:val="16"/>
+              </w:rPr>
+              <w:t>1. 본문 흐름에 맞는 이미지 프롬프트를 만든다.</w:t>
+            </w:r>
+          </w:p>
+          <w:p>
+            <w:r>
+              <w:rPr>
+                <w:rFonts w:ascii="Courier New" w:hAnsi="Courier New" w:eastAsia="Noto Sans KR"/>
+                <w:color w:val="0F172A"/>
+                <w:sz w:val="16"/>
+              </w:rPr>
+              <w:t>2. AI 이미지 생성 API를 호출한다.</w:t>
+            </w:r>
+          </w:p>
+          <w:p>
+            <w:r>
+              <w:rPr>
+                <w:rFonts w:ascii="Courier New" w:hAnsi="Courier New" w:eastAsia="Noto Sans KR"/>
+                <w:color w:val="0F172A"/>
+                <w:sz w:val="16"/>
+              </w:rPr>
+              <w:t>3. 업로드 이미지와 생성 이미지를 구분해 저장한다.</w:t>
+            </w:r>
+          </w:p>
+          <w:p>
+            <w:r>
+              <w:rPr>
+                <w:rFonts w:ascii="Courier New" w:hAnsi="Courier New" w:eastAsia="Noto Sans KR"/>
+                <w:color w:val="0F172A"/>
+                <w:sz w:val="16"/>
+              </w:rPr>
+              <w:t>4. Markdown 본문 안에 [이미지 1 삽입 위치] 같은 마커를 넣는다.</w:t>
+            </w:r>
+          </w:p>
+          <w:p>
+            <w:r>
+              <w:rPr>
+                <w:rFonts w:ascii="Courier New" w:hAnsi="Courier New" w:eastAsia="Noto Sans KR"/>
+                <w:color w:val="0F172A"/>
+                <w:sz w:val="16"/>
+              </w:rPr>
+            </w:r>
+          </w:p>
+          <w:p>
+            <w:r>
+              <w:rPr>
+                <w:rFonts w:ascii="Courier New" w:hAnsi="Courier New" w:eastAsia="Noto Sans KR"/>
+                <w:color w:val="0F172A"/>
+                <w:sz w:val="16"/>
+              </w:rPr>
+              <w:t>출력:</w:t>
+            </w:r>
+          </w:p>
+          <w:p>
+            <w:r>
+              <w:rPr>
+                <w:rFonts w:ascii="Courier New" w:hAnsi="Courier New" w:eastAsia="Noto Sans KR"/>
+                <w:color w:val="0F172A"/>
+                <w:sz w:val="16"/>
+              </w:rPr>
+              <w:t>- 이미지 파일</w:t>
+            </w:r>
+          </w:p>
+          <w:p>
+            <w:r>
+              <w:rPr>
+                <w:rFonts w:ascii="Courier New" w:hAnsi="Courier New" w:eastAsia="Noto Sans KR"/>
+                <w:color w:val="0F172A"/>
+                <w:sz w:val="16"/>
+              </w:rPr>
+              <w:t>- 이미지 설명</w:t>
+            </w:r>
+          </w:p>
+          <w:p>
+            <w:r>
+              <w:rPr>
+                <w:rFonts w:ascii="Courier New" w:hAnsi="Courier New" w:eastAsia="Noto Sans KR"/>
+                <w:color w:val="0F172A"/>
+                <w:sz w:val="16"/>
+              </w:rPr>
+              <w:t>- 본문 삽입 위치</w:t>
+            </w:r>
+          </w:p>
+          <w:p>
+            <w:r>
+              <w:rPr>
+                <w:rFonts w:ascii="Courier New" w:hAnsi="Courier New" w:eastAsia="Noto Sans KR"/>
+                <w:color w:val="0F172A"/>
+                <w:sz w:val="16"/>
+              </w:rPr>
+              <w:t>- HTML 변환 시 이미지 마커 유지</w:t>
+            </w:r>
+          </w:p>
+        </w:tc>
+      </w:tr>
+    </w:tbl>
+    <w:p/>
+    <w:p>
+      <w:pPr>
+        <w:pStyle w:val="Heading1"/>
+      </w:pPr>
+      <w:r>
+        <w:t>P-08. 썸네일 제작 모듈 프롬프트</w:t>
+      </w:r>
+    </w:p>
+    <w:tbl>
+      <w:tblPr>
+        <w:tblStyle w:val="TableGrid"/>
+        <w:tblW w:type="auto" w:w="0"/>
+        <w:tblLook w:firstColumn="1" w:firstRow="1" w:lastColumn="0" w:lastRow="0" w:noHBand="0" w:noVBand="1" w:val="04A0"/>
+      </w:tblPr>
+      <w:tblGrid>
+        <w:gridCol w:w="10166"/>
+      </w:tblGrid>
+      <w:tr>
+        <w:tc>
+          <w:tcPr>
+            <w:tcW w:type="dxa" w:w="10166"/>
+            <w:shd w:fill="F1F5F9"/>
+          </w:tcPr>
+          <w:p>
+            <w:r/>
+          </w:p>
+          <w:p>
+            <w:r>
+              <w:rPr>
+                <w:rFonts w:ascii="Courier New" w:hAnsi="Courier New" w:eastAsia="Noto Sans KR"/>
+                <w:color w:val="0F172A"/>
+                <w:sz w:val="16"/>
+              </w:rPr>
+              <w:t>병원 블로그용 썸네일 제작 화면을 Streamlit 페이지로 설계해줘.</w:t>
+            </w:r>
+          </w:p>
+          <w:p>
+            <w:r>
+              <w:rPr>
+                <w:rFonts w:ascii="Courier New" w:hAnsi="Courier New" w:eastAsia="Noto Sans KR"/>
+                <w:color w:val="0F172A"/>
+                <w:sz w:val="16"/>
+              </w:rPr>
+            </w:r>
+          </w:p>
+          <w:p>
+            <w:r>
+              <w:rPr>
+                <w:rFonts w:ascii="Courier New" w:hAnsi="Courier New" w:eastAsia="Noto Sans KR"/>
+                <w:color w:val="0F172A"/>
+                <w:sz w:val="16"/>
+              </w:rPr>
+              <w:t>기능:</w:t>
+            </w:r>
+          </w:p>
+          <w:p>
+            <w:r>
+              <w:rPr>
+                <w:rFonts w:ascii="Courier New" w:hAnsi="Courier New" w:eastAsia="Noto Sans KR"/>
+                <w:color w:val="0F172A"/>
+                <w:sz w:val="16"/>
+              </w:rPr>
+              <w:t>- 제목/부제목 텍스트 입력</w:t>
+            </w:r>
+          </w:p>
+          <w:p>
+            <w:r>
+              <w:rPr>
+                <w:rFonts w:ascii="Courier New" w:hAnsi="Courier New" w:eastAsia="Noto Sans KR"/>
+                <w:color w:val="0F172A"/>
+                <w:sz w:val="16"/>
+              </w:rPr>
+              <w:t>- 글자 크기, 색상, 위치 조절</w:t>
+            </w:r>
+          </w:p>
+          <w:p>
+            <w:r>
+              <w:rPr>
+                <w:rFonts w:ascii="Courier New" w:hAnsi="Courier New" w:eastAsia="Noto Sans KR"/>
+                <w:color w:val="0F172A"/>
+                <w:sz w:val="16"/>
+              </w:rPr>
+              <w:t>- 배경 색상 또는 이미지 업로드</w:t>
+            </w:r>
+          </w:p>
+          <w:p>
+            <w:r>
+              <w:rPr>
+                <w:rFonts w:ascii="Courier New" w:hAnsi="Courier New" w:eastAsia="Noto Sans KR"/>
+                <w:color w:val="0F172A"/>
+                <w:sz w:val="16"/>
+              </w:rPr>
+              <w:t>- 템플릿 선택</w:t>
+            </w:r>
+          </w:p>
+          <w:p>
+            <w:r>
+              <w:rPr>
+                <w:rFonts w:ascii="Courier New" w:hAnsi="Courier New" w:eastAsia="Noto Sans KR"/>
+                <w:color w:val="0F172A"/>
+                <w:sz w:val="16"/>
+              </w:rPr>
+              <w:t>- 정렬과 여백 조절</w:t>
+            </w:r>
+          </w:p>
+          <w:p>
+            <w:r>
+              <w:rPr>
+                <w:rFonts w:ascii="Courier New" w:hAnsi="Courier New" w:eastAsia="Noto Sans KR"/>
+                <w:color w:val="0F172A"/>
+                <w:sz w:val="16"/>
+              </w:rPr>
+              <w:t>- 미리보기</w:t>
+            </w:r>
+          </w:p>
+          <w:p>
+            <w:r>
+              <w:rPr>
+                <w:rFonts w:ascii="Courier New" w:hAnsi="Courier New" w:eastAsia="Noto Sans KR"/>
+                <w:color w:val="0F172A"/>
+                <w:sz w:val="16"/>
+              </w:rPr>
+              <w:t>- PNG 다운로드</w:t>
+            </w:r>
+          </w:p>
+          <w:p>
+            <w:r>
+              <w:rPr>
+                <w:rFonts w:ascii="Courier New" w:hAnsi="Courier New" w:eastAsia="Noto Sans KR"/>
+                <w:color w:val="0F172A"/>
+                <w:sz w:val="16"/>
+              </w:rPr>
+            </w:r>
+          </w:p>
+          <w:p>
+            <w:r>
+              <w:rPr>
+                <w:rFonts w:ascii="Courier New" w:hAnsi="Courier New" w:eastAsia="Noto Sans KR"/>
+                <w:color w:val="0F172A"/>
+                <w:sz w:val="16"/>
+              </w:rPr>
+              <w:t>구현 방향:</w:t>
+            </w:r>
+          </w:p>
+          <w:p>
+            <w:r>
+              <w:rPr>
+                <w:rFonts w:ascii="Courier New" w:hAnsi="Courier New" w:eastAsia="Noto Sans KR"/>
+                <w:color w:val="0F172A"/>
+                <w:sz w:val="16"/>
+              </w:rPr>
+              <w:t>- Python에서 기본 썸네일 데이터를 만들고, 브라우저 편집 영역은 Fabric.js 방식으로 처리한다.</w:t>
+            </w:r>
+          </w:p>
+          <w:p>
+            <w:r>
+              <w:rPr>
+                <w:rFonts w:ascii="Courier New" w:hAnsi="Courier New" w:eastAsia="Noto Sans KR"/>
+                <w:color w:val="0F172A"/>
+                <w:sz w:val="16"/>
+              </w:rPr>
+              <w:t>- 의료 콘텐츠에 어울리도록 과도한 광고 느낌보다 깔끔한 정보형 디자인을 기본값으로 둔다.</w:t>
+            </w:r>
+          </w:p>
+        </w:tc>
+      </w:tr>
+    </w:tbl>
+    <w:p/>
+    <w:p>
+      <w:pPr>
+        <w:pStyle w:val="Heading1"/>
+      </w:pPr>
+      <w:r>
+        <w:t>P-09. 워터마크 모듈 프롬프트</w:t>
+      </w:r>
+    </w:p>
+    <w:tbl>
+      <w:tblPr>
+        <w:tblStyle w:val="TableGrid"/>
+        <w:tblW w:type="auto" w:w="0"/>
+        <w:tblLook w:firstColumn="1" w:firstRow="1" w:lastColumn="0" w:lastRow="0" w:noHBand="0" w:noVBand="1" w:val="04A0"/>
+      </w:tblPr>
+      <w:tblGrid>
+        <w:gridCol w:w="10166"/>
+      </w:tblGrid>
+      <w:tr>
+        <w:tc>
+          <w:tcPr>
+            <w:tcW w:type="dxa" w:w="10166"/>
+            <w:shd w:fill="F1F5F9"/>
+          </w:tcPr>
+          <w:p>
+            <w:r/>
+          </w:p>
+          <w:p>
+            <w:r>
+              <w:rPr>
+                <w:rFonts w:ascii="Courier New" w:hAnsi="Courier New" w:eastAsia="Noto Sans KR"/>
+                <w:color w:val="0F172A"/>
+                <w:sz w:val="16"/>
+              </w:rPr>
+              <w:t>이미지와 PDF에 병원 워터마크를 적용하는 모듈을 작성해줘.</w:t>
+            </w:r>
+          </w:p>
+          <w:p>
+            <w:r>
+              <w:rPr>
+                <w:rFonts w:ascii="Courier New" w:hAnsi="Courier New" w:eastAsia="Noto Sans KR"/>
+                <w:color w:val="0F172A"/>
+                <w:sz w:val="16"/>
+              </w:rPr>
+            </w:r>
+          </w:p>
+          <w:p>
+            <w:r>
+              <w:rPr>
+                <w:rFonts w:ascii="Courier New" w:hAnsi="Courier New" w:eastAsia="Noto Sans KR"/>
+                <w:color w:val="0F172A"/>
+                <w:sz w:val="16"/>
+              </w:rPr>
+              <w:t>입력:</w:t>
+            </w:r>
+          </w:p>
+          <w:p>
+            <w:r>
+              <w:rPr>
+                <w:rFonts w:ascii="Courier New" w:hAnsi="Courier New" w:eastAsia="Noto Sans KR"/>
+                <w:color w:val="0F172A"/>
+                <w:sz w:val="16"/>
+              </w:rPr>
+              <w:t>- 이미지 또는 PDF 파일</w:t>
+            </w:r>
+          </w:p>
+          <w:p>
+            <w:r>
+              <w:rPr>
+                <w:rFonts w:ascii="Courier New" w:hAnsi="Courier New" w:eastAsia="Noto Sans KR"/>
+                <w:color w:val="0F172A"/>
+                <w:sz w:val="16"/>
+              </w:rPr>
+              <w:t>- 워터마크 텍스트</w:t>
+            </w:r>
+          </w:p>
+          <w:p>
+            <w:r>
+              <w:rPr>
+                <w:rFonts w:ascii="Courier New" w:hAnsi="Courier New" w:eastAsia="Noto Sans KR"/>
+                <w:color w:val="0F172A"/>
+                <w:sz w:val="16"/>
+              </w:rPr>
+              <w:t>- 위치</w:t>
+            </w:r>
+          </w:p>
+          <w:p>
+            <w:r>
+              <w:rPr>
+                <w:rFonts w:ascii="Courier New" w:hAnsi="Courier New" w:eastAsia="Noto Sans KR"/>
+                <w:color w:val="0F172A"/>
+                <w:sz w:val="16"/>
+              </w:rPr>
+              <w:t>- 투명도</w:t>
+            </w:r>
+          </w:p>
+          <w:p>
+            <w:r>
+              <w:rPr>
+                <w:rFonts w:ascii="Courier New" w:hAnsi="Courier New" w:eastAsia="Noto Sans KR"/>
+                <w:color w:val="0F172A"/>
+                <w:sz w:val="16"/>
+              </w:rPr>
+              <w:t>- 색상</w:t>
+            </w:r>
+          </w:p>
+          <w:p>
+            <w:r>
+              <w:rPr>
+                <w:rFonts w:ascii="Courier New" w:hAnsi="Courier New" w:eastAsia="Noto Sans KR"/>
+                <w:color w:val="0F172A"/>
+                <w:sz w:val="16"/>
+              </w:rPr>
+              <w:t>- 글자 크기</w:t>
+            </w:r>
+          </w:p>
+          <w:p>
+            <w:r>
+              <w:rPr>
+                <w:rFonts w:ascii="Courier New" w:hAnsi="Courier New" w:eastAsia="Noto Sans KR"/>
+                <w:color w:val="0F172A"/>
+                <w:sz w:val="16"/>
+              </w:rPr>
+            </w:r>
+          </w:p>
+          <w:p>
+            <w:r>
+              <w:rPr>
+                <w:rFonts w:ascii="Courier New" w:hAnsi="Courier New" w:eastAsia="Noto Sans KR"/>
+                <w:color w:val="0F172A"/>
+                <w:sz w:val="16"/>
+              </w:rPr>
+              <w:t>처리:</w:t>
+            </w:r>
+          </w:p>
+          <w:p>
+            <w:r>
+              <w:rPr>
+                <w:rFonts w:ascii="Courier New" w:hAnsi="Courier New" w:eastAsia="Noto Sans KR"/>
+                <w:color w:val="0F172A"/>
+                <w:sz w:val="16"/>
+              </w:rPr>
+              <w:t>1. 파일 유형을 판별한다.</w:t>
+            </w:r>
+          </w:p>
+          <w:p>
+            <w:r>
+              <w:rPr>
+                <w:rFonts w:ascii="Courier New" w:hAnsi="Courier New" w:eastAsia="Noto Sans KR"/>
+                <w:color w:val="0F172A"/>
+                <w:sz w:val="16"/>
+              </w:rPr>
+              <w:t>2. 이미지 파일은 Pillow로 처리한다.</w:t>
+            </w:r>
+          </w:p>
+          <w:p>
+            <w:r>
+              <w:rPr>
+                <w:rFonts w:ascii="Courier New" w:hAnsi="Courier New" w:eastAsia="Noto Sans KR"/>
+                <w:color w:val="0F172A"/>
+                <w:sz w:val="16"/>
+              </w:rPr>
+              <w:t>3. PDF 파일은 pypdf/reportlab 기반으로 처리한다.</w:t>
+            </w:r>
+          </w:p>
+          <w:p>
+            <w:r>
+              <w:rPr>
+                <w:rFonts w:ascii="Courier New" w:hAnsi="Courier New" w:eastAsia="Noto Sans KR"/>
+                <w:color w:val="0F172A"/>
+                <w:sz w:val="16"/>
+              </w:rPr>
+              <w:t>4. 사용자가 선택한 위치와 투명도를 반영한다.</w:t>
+            </w:r>
+          </w:p>
+          <w:p>
+            <w:r>
+              <w:rPr>
+                <w:rFonts w:ascii="Courier New" w:hAnsi="Courier New" w:eastAsia="Noto Sans KR"/>
+                <w:color w:val="0F172A"/>
+                <w:sz w:val="16"/>
+              </w:rPr>
+            </w:r>
+          </w:p>
+          <w:p>
+            <w:r>
+              <w:rPr>
+                <w:rFonts w:ascii="Courier New" w:hAnsi="Courier New" w:eastAsia="Noto Sans KR"/>
+                <w:color w:val="0F172A"/>
+                <w:sz w:val="16"/>
+              </w:rPr>
+              <w:t>출력:</w:t>
+            </w:r>
+          </w:p>
+          <w:p>
+            <w:r>
+              <w:rPr>
+                <w:rFonts w:ascii="Courier New" w:hAnsi="Courier New" w:eastAsia="Noto Sans KR"/>
+                <w:color w:val="0F172A"/>
+                <w:sz w:val="16"/>
+              </w:rPr>
+              <w:t>- 워터마크 적용 파일</w:t>
+            </w:r>
+          </w:p>
+          <w:p>
+            <w:r>
+              <w:rPr>
+                <w:rFonts w:ascii="Courier New" w:hAnsi="Courier New" w:eastAsia="Noto Sans KR"/>
+                <w:color w:val="0F172A"/>
+                <w:sz w:val="16"/>
+              </w:rPr>
+              <w:t>- 다운로드 버튼</w:t>
+            </w:r>
+          </w:p>
+          <w:p>
+            <w:r>
+              <w:rPr>
+                <w:rFonts w:ascii="Courier New" w:hAnsi="Courier New" w:eastAsia="Noto Sans KR"/>
+                <w:color w:val="0F172A"/>
+                <w:sz w:val="16"/>
+              </w:rPr>
+              <w:t>- 처리 실패 시 오류 메시지</w:t>
+            </w:r>
+          </w:p>
+        </w:tc>
+      </w:tr>
+    </w:tbl>
+    <w:p/>
+    <w:p>
+      <w:pPr>
+        <w:pStyle w:val="Heading1"/>
+      </w:pPr>
+      <w:r>
+        <w:t>P-10. 데이터 저장·캐시 프롬프트</w:t>
+      </w:r>
+    </w:p>
+    <w:tbl>
+      <w:tblPr>
+        <w:tblStyle w:val="TableGrid"/>
+        <w:tblW w:type="auto" w:w="0"/>
+        <w:tblLook w:firstColumn="1" w:firstRow="1" w:lastColumn="0" w:lastRow="0" w:noHBand="0" w:noVBand="1" w:val="04A0"/>
+      </w:tblPr>
+      <w:tblGrid>
+        <w:gridCol w:w="10166"/>
+      </w:tblGrid>
+      <w:tr>
+        <w:tc>
+          <w:tcPr>
+            <w:tcW w:type="dxa" w:w="10166"/>
+            <w:shd w:fill="F1F5F9"/>
+          </w:tcPr>
+          <w:p>
+            <w:r/>
+          </w:p>
+          <w:p>
+            <w:r>
+              <w:rPr>
+                <w:rFonts w:ascii="Courier New" w:hAnsi="Courier New" w:eastAsia="Noto Sans KR"/>
+                <w:color w:val="0F172A"/>
+                <w:sz w:val="16"/>
+              </w:rPr>
+              <w:t>SQLite/Supabase 기반 데이터 저장 구조를 정리하고 구현 코드를 작성해줘.</w:t>
+            </w:r>
+          </w:p>
+          <w:p>
+            <w:r>
+              <w:rPr>
+                <w:rFonts w:ascii="Courier New" w:hAnsi="Courier New" w:eastAsia="Noto Sans KR"/>
+                <w:color w:val="0F172A"/>
+                <w:sz w:val="16"/>
+              </w:rPr>
+            </w:r>
+          </w:p>
+          <w:p>
+            <w:r>
+              <w:rPr>
+                <w:rFonts w:ascii="Courier New" w:hAnsi="Courier New" w:eastAsia="Noto Sans KR"/>
+                <w:color w:val="0F172A"/>
+                <w:sz w:val="16"/>
+              </w:rPr>
+              <w:t>테이블:</w:t>
+            </w:r>
+          </w:p>
+          <w:p>
+            <w:r>
+              <w:rPr>
+                <w:rFonts w:ascii="Courier New" w:hAnsi="Courier New" w:eastAsia="Noto Sans KR"/>
+                <w:color w:val="0F172A"/>
+                <w:sz w:val="16"/>
+              </w:rPr>
+              <w:t>- personas: 페르소나 정보</w:t>
+            </w:r>
+          </w:p>
+          <w:p>
+            <w:r>
+              <w:rPr>
+                <w:rFonts w:ascii="Courier New" w:hAnsi="Courier New" w:eastAsia="Noto Sans KR"/>
+                <w:color w:val="0F172A"/>
+                <w:sz w:val="16"/>
+              </w:rPr>
+              <w:t>- generations: 생성 글, 사용 프롬프트, Markdown, HTML</w:t>
+            </w:r>
+          </w:p>
+          <w:p>
+            <w:r>
+              <w:rPr>
+                <w:rFonts w:ascii="Courier New" w:hAnsi="Courier New" w:eastAsia="Noto Sans KR"/>
+                <w:color w:val="0F172A"/>
+                <w:sz w:val="16"/>
+              </w:rPr>
+              <w:t>- blog_styles: 병원 글쓰기 스타일</w:t>
+            </w:r>
+          </w:p>
+          <w:p>
+            <w:r>
+              <w:rPr>
+                <w:rFonts w:ascii="Courier New" w:hAnsi="Courier New" w:eastAsia="Noto Sans KR"/>
+                <w:color w:val="0F172A"/>
+                <w:sz w:val="16"/>
+              </w:rPr>
+              <w:t>- blog_posts: 레퍼런스 글</w:t>
+            </w:r>
+          </w:p>
+          <w:p>
+            <w:r>
+              <w:rPr>
+                <w:rFonts w:ascii="Courier New" w:hAnsi="Courier New" w:eastAsia="Noto Sans KR"/>
+                <w:color w:val="0F172A"/>
+                <w:sz w:val="16"/>
+              </w:rPr>
+              <w:t>- keyword_cache: 키워드 분석 캐시</w:t>
+            </w:r>
+          </w:p>
+          <w:p>
+            <w:r>
+              <w:rPr>
+                <w:rFonts w:ascii="Courier New" w:hAnsi="Courier New" w:eastAsia="Noto Sans KR"/>
+                <w:color w:val="0F172A"/>
+                <w:sz w:val="16"/>
+              </w:rPr>
+              <w:t>- skills: 기능 활성화 설정</w:t>
+            </w:r>
+          </w:p>
+          <w:p>
+            <w:r>
+              <w:rPr>
+                <w:rFonts w:ascii="Courier New" w:hAnsi="Courier New" w:eastAsia="Noto Sans KR"/>
+                <w:color w:val="0F172A"/>
+                <w:sz w:val="16"/>
+              </w:rPr>
+              <w:t>- app_config: 앱 설정</w:t>
+            </w:r>
+          </w:p>
+          <w:p>
+            <w:r>
+              <w:rPr>
+                <w:rFonts w:ascii="Courier New" w:hAnsi="Courier New" w:eastAsia="Noto Sans KR"/>
+                <w:color w:val="0F172A"/>
+                <w:sz w:val="16"/>
+              </w:rPr>
+            </w:r>
+          </w:p>
+          <w:p>
+            <w:r>
+              <w:rPr>
+                <w:rFonts w:ascii="Courier New" w:hAnsi="Courier New" w:eastAsia="Noto Sans KR"/>
+                <w:color w:val="0F172A"/>
+                <w:sz w:val="16"/>
+              </w:rPr>
+              <w:t>요구사항:</w:t>
+            </w:r>
+          </w:p>
+          <w:p>
+            <w:r>
+              <w:rPr>
+                <w:rFonts w:ascii="Courier New" w:hAnsi="Courier New" w:eastAsia="Noto Sans KR"/>
+                <w:color w:val="0F172A"/>
+                <w:sz w:val="16"/>
+              </w:rPr>
+              <w:t>- 생성 결과는 나중에 다시 볼 수 있어야 한다.</w:t>
+            </w:r>
+          </w:p>
+          <w:p>
+            <w:r>
+              <w:rPr>
+                <w:rFonts w:ascii="Courier New" w:hAnsi="Courier New" w:eastAsia="Noto Sans KR"/>
+                <w:color w:val="0F172A"/>
+                <w:sz w:val="16"/>
+              </w:rPr>
+              <w:t>- 키워드 분석 결과는 일정 시간 캐시해 API 호출을 줄인다.</w:t>
+            </w:r>
+          </w:p>
+          <w:p>
+            <w:r>
+              <w:rPr>
+                <w:rFonts w:ascii="Courier New" w:hAnsi="Courier New" w:eastAsia="Noto Sans KR"/>
+                <w:color w:val="0F172A"/>
+                <w:sz w:val="16"/>
+              </w:rPr>
+              <w:t>- API 키는 DB에 저장하지 않는다.</w:t>
+            </w:r>
+          </w:p>
+        </w:tc>
+      </w:tr>
+    </w:tbl>
+    <w:p/>
+    <w:p>
+      <w:pPr>
+        <w:pStyle w:val="Heading1"/>
+      </w:pPr>
+      <w:r>
+        <w:t>P-11. 배포 프롬프트</w:t>
+      </w:r>
+    </w:p>
+    <w:tbl>
+      <w:tblPr>
+        <w:tblStyle w:val="TableGrid"/>
+        <w:tblW w:type="auto" w:w="0"/>
+        <w:tblLook w:firstColumn="1" w:firstRow="1" w:lastColumn="0" w:lastRow="0" w:noHBand="0" w:noVBand="1" w:val="04A0"/>
+      </w:tblPr>
+      <w:tblGrid>
+        <w:gridCol w:w="10166"/>
+      </w:tblGrid>
+      <w:tr>
+        <w:tc>
+          <w:tcPr>
+            <w:tcW w:type="dxa" w:w="10166"/>
+            <w:shd w:fill="F1F5F9"/>
+          </w:tcPr>
+          <w:p>
+            <w:r/>
+          </w:p>
+          <w:p>
+            <w:r>
+              <w:rPr>
+                <w:rFonts w:ascii="Courier New" w:hAnsi="Courier New" w:eastAsia="Noto Sans KR"/>
+                <w:color w:val="0F172A"/>
+                <w:sz w:val="16"/>
+              </w:rPr>
+              <w:t>이 Streamlit 앱을 GitHub와 Streamlit Cloud로 배포하는 절차를 정리해줘.</w:t>
+            </w:r>
+          </w:p>
+          <w:p>
+            <w:r>
+              <w:rPr>
+                <w:rFonts w:ascii="Courier New" w:hAnsi="Courier New" w:eastAsia="Noto Sans KR"/>
+                <w:color w:val="0F172A"/>
+                <w:sz w:val="16"/>
+              </w:rPr>
+            </w:r>
+          </w:p>
+          <w:p>
+            <w:r>
+              <w:rPr>
+                <w:rFonts w:ascii="Courier New" w:hAnsi="Courier New" w:eastAsia="Noto Sans KR"/>
+                <w:color w:val="0F172A"/>
+                <w:sz w:val="16"/>
+              </w:rPr>
+              <w:t>필요 파일:</w:t>
+            </w:r>
+          </w:p>
+          <w:p>
+            <w:r>
+              <w:rPr>
+                <w:rFonts w:ascii="Courier New" w:hAnsi="Courier New" w:eastAsia="Noto Sans KR"/>
+                <w:color w:val="0F172A"/>
+                <w:sz w:val="16"/>
+              </w:rPr>
+              <w:t>- app.py</w:t>
+            </w:r>
+          </w:p>
+          <w:p>
+            <w:r>
+              <w:rPr>
+                <w:rFonts w:ascii="Courier New" w:hAnsi="Courier New" w:eastAsia="Noto Sans KR"/>
+                <w:color w:val="0F172A"/>
+                <w:sz w:val="16"/>
+              </w:rPr>
+              <w:t>- pages/</w:t>
+            </w:r>
+          </w:p>
+          <w:p>
+            <w:r>
+              <w:rPr>
+                <w:rFonts w:ascii="Courier New" w:hAnsi="Courier New" w:eastAsia="Noto Sans KR"/>
+                <w:color w:val="0F172A"/>
+                <w:sz w:val="16"/>
+              </w:rPr>
+              <w:t>- src/naverblog/</w:t>
+            </w:r>
+          </w:p>
+          <w:p>
+            <w:r>
+              <w:rPr>
+                <w:rFonts w:ascii="Courier New" w:hAnsi="Courier New" w:eastAsia="Noto Sans KR"/>
+                <w:color w:val="0F172A"/>
+                <w:sz w:val="16"/>
+              </w:rPr>
+              <w:t>- requirements.txt</w:t>
+            </w:r>
+          </w:p>
+          <w:p>
+            <w:r>
+              <w:rPr>
+                <w:rFonts w:ascii="Courier New" w:hAnsi="Courier New" w:eastAsia="Noto Sans KR"/>
+                <w:color w:val="0F172A"/>
+                <w:sz w:val="16"/>
+              </w:rPr>
+              <w:t>- packages.txt</w:t>
+            </w:r>
+          </w:p>
+          <w:p>
+            <w:r>
+              <w:rPr>
+                <w:rFonts w:ascii="Courier New" w:hAnsi="Courier New" w:eastAsia="Noto Sans KR"/>
+                <w:color w:val="0F172A"/>
+                <w:sz w:val="16"/>
+              </w:rPr>
+              <w:t>- runtime.txt</w:t>
+            </w:r>
+          </w:p>
+          <w:p>
+            <w:r>
+              <w:rPr>
+                <w:rFonts w:ascii="Courier New" w:hAnsi="Courier New" w:eastAsia="Noto Sans KR"/>
+                <w:color w:val="0F172A"/>
+                <w:sz w:val="16"/>
+              </w:rPr>
+            </w:r>
+          </w:p>
+          <w:p>
+            <w:r>
+              <w:rPr>
+                <w:rFonts w:ascii="Courier New" w:hAnsi="Courier New" w:eastAsia="Noto Sans KR"/>
+                <w:color w:val="0F172A"/>
+                <w:sz w:val="16"/>
+              </w:rPr>
+              <w:t>절차:</w:t>
+            </w:r>
+          </w:p>
+          <w:p>
+            <w:r>
+              <w:rPr>
+                <w:rFonts w:ascii="Courier New" w:hAnsi="Courier New" w:eastAsia="Noto Sans KR"/>
+                <w:color w:val="0F172A"/>
+                <w:sz w:val="16"/>
+              </w:rPr>
+              <w:t>1. GitHub에 최신 코드를 push한다.</w:t>
+            </w:r>
+          </w:p>
+          <w:p>
+            <w:r>
+              <w:rPr>
+                <w:rFonts w:ascii="Courier New" w:hAnsi="Courier New" w:eastAsia="Noto Sans KR"/>
+                <w:color w:val="0F172A"/>
+                <w:sz w:val="16"/>
+              </w:rPr>
+              <w:t>2. Streamlit Cloud에서 저장소를 연결한다.</w:t>
+            </w:r>
+          </w:p>
+          <w:p>
+            <w:r>
+              <w:rPr>
+                <w:rFonts w:ascii="Courier New" w:hAnsi="Courier New" w:eastAsia="Noto Sans KR"/>
+                <w:color w:val="0F172A"/>
+                <w:sz w:val="16"/>
+              </w:rPr>
+              <w:t>3. app.py를 엔트리포인트로 지정한다.</w:t>
+            </w:r>
+          </w:p>
+          <w:p>
+            <w:r>
+              <w:rPr>
+                <w:rFonts w:ascii="Courier New" w:hAnsi="Courier New" w:eastAsia="Noto Sans KR"/>
+                <w:color w:val="0F172A"/>
+                <w:sz w:val="16"/>
+              </w:rPr>
+              <w:t>4. API 키는 Secrets에 등록한다.</w:t>
+            </w:r>
+          </w:p>
+          <w:p>
+            <w:r>
+              <w:rPr>
+                <w:rFonts w:ascii="Courier New" w:hAnsi="Courier New" w:eastAsia="Noto Sans KR"/>
+                <w:color w:val="0F172A"/>
+                <w:sz w:val="16"/>
+              </w:rPr>
+              <w:t>5. 배포 후 주요 페이지가 열리는지 확인한다.</w:t>
+            </w:r>
+          </w:p>
+          <w:p>
+            <w:r>
+              <w:rPr>
+                <w:rFonts w:ascii="Courier New" w:hAnsi="Courier New" w:eastAsia="Noto Sans KR"/>
+                <w:color w:val="0F172A"/>
+                <w:sz w:val="16"/>
+              </w:rPr>
+            </w:r>
+          </w:p>
+          <w:p>
+            <w:r>
+              <w:rPr>
+                <w:rFonts w:ascii="Courier New" w:hAnsi="Courier New" w:eastAsia="Noto Sans KR"/>
+                <w:color w:val="0F172A"/>
+                <w:sz w:val="16"/>
+              </w:rPr>
+              <w:t>출력:</w:t>
+            </w:r>
+          </w:p>
+          <w:p>
+            <w:r>
+              <w:rPr>
+                <w:rFonts w:ascii="Courier New" w:hAnsi="Courier New" w:eastAsia="Noto Sans KR"/>
+                <w:color w:val="0F172A"/>
+                <w:sz w:val="16"/>
+              </w:rPr>
+              <w:t>- 배포 체크리스트</w:t>
+            </w:r>
+          </w:p>
+          <w:p>
+            <w:r>
+              <w:rPr>
+                <w:rFonts w:ascii="Courier New" w:hAnsi="Courier New" w:eastAsia="Noto Sans KR"/>
+                <w:color w:val="0F172A"/>
+                <w:sz w:val="16"/>
+              </w:rPr>
+              <w:t>- 배포 실패 시 확인할 항목</w:t>
+            </w:r>
+          </w:p>
+        </w:tc>
+      </w:tr>
+    </w:tbl>
+    <w:p/>
+    <w:p>
+      <w:pPr>
+        <w:pStyle w:val="Heading1"/>
+      </w:pPr>
+      <w:r>
+        <w:t>P-12. 구현 검증 프롬프트</w:t>
+      </w:r>
+    </w:p>
+    <w:tbl>
+      <w:tblPr>
+        <w:tblStyle w:val="TableGrid"/>
+        <w:tblW w:type="auto" w:w="0"/>
+        <w:tblLook w:firstColumn="1" w:firstRow="1" w:lastColumn="0" w:lastRow="0" w:noHBand="0" w:noVBand="1" w:val="04A0"/>
+      </w:tblPr>
+      <w:tblGrid>
+        <w:gridCol w:w="10166"/>
+      </w:tblGrid>
+      <w:tr>
+        <w:tc>
+          <w:tcPr>
+            <w:tcW w:type="dxa" w:w="10166"/>
+            <w:shd w:fill="F1F5F9"/>
+          </w:tcPr>
+          <w:p>
+            <w:r/>
+          </w:p>
+          <w:p>
+            <w:r>
+              <w:rPr>
+                <w:rFonts w:ascii="Courier New" w:hAnsi="Courier New" w:eastAsia="Noto Sans KR"/>
+                <w:color w:val="0F172A"/>
+                <w:sz w:val="16"/>
+              </w:rPr>
+              <w:t>완성된 병원 마케팅 블로그 생성기 프로토타입을 테스트해줘.</w:t>
+            </w:r>
+          </w:p>
+          <w:p>
+            <w:r>
+              <w:rPr>
+                <w:rFonts w:ascii="Courier New" w:hAnsi="Courier New" w:eastAsia="Noto Sans KR"/>
+                <w:color w:val="0F172A"/>
+                <w:sz w:val="16"/>
+              </w:rPr>
+            </w:r>
+          </w:p>
+          <w:p>
+            <w:r>
+              <w:rPr>
+                <w:rFonts w:ascii="Courier New" w:hAnsi="Courier New" w:eastAsia="Noto Sans KR"/>
+                <w:color w:val="0F172A"/>
+                <w:sz w:val="16"/>
+              </w:rPr>
+              <w:t>테스트 시나리오:</w:t>
+            </w:r>
+          </w:p>
+          <w:p>
+            <w:r>
+              <w:rPr>
+                <w:rFonts w:ascii="Courier New" w:hAnsi="Courier New" w:eastAsia="Noto Sans KR"/>
+                <w:color w:val="0F172A"/>
+                <w:sz w:val="16"/>
+              </w:rPr>
+              <w:t>1. 강남 내과 감기 몸살 글 생성</w:t>
+            </w:r>
+          </w:p>
+          <w:p>
+            <w:r>
+              <w:rPr>
+                <w:rFonts w:ascii="Courier New" w:hAnsi="Courier New" w:eastAsia="Noto Sans KR"/>
+                <w:color w:val="0F172A"/>
+                <w:sz w:val="16"/>
+              </w:rPr>
+              <w:t>2. 완치 보장 같은 위험 표현 점검</w:t>
+            </w:r>
+          </w:p>
+          <w:p>
+            <w:r>
+              <w:rPr>
+                <w:rFonts w:ascii="Courier New" w:hAnsi="Courier New" w:eastAsia="Noto Sans KR"/>
+                <w:color w:val="0F172A"/>
+                <w:sz w:val="16"/>
+              </w:rPr>
+              <w:t>3. 키워드 등급과 포화지수 조회</w:t>
+            </w:r>
+          </w:p>
+          <w:p>
+            <w:r>
+              <w:rPr>
+                <w:rFonts w:ascii="Courier New" w:hAnsi="Courier New" w:eastAsia="Noto Sans KR"/>
+                <w:color w:val="0F172A"/>
+                <w:sz w:val="16"/>
+              </w:rPr>
+              <w:t>4. 스마트블록 분석 표시</w:t>
+            </w:r>
+          </w:p>
+          <w:p>
+            <w:r>
+              <w:rPr>
+                <w:rFonts w:ascii="Courier New" w:hAnsi="Courier New" w:eastAsia="Noto Sans KR"/>
+                <w:color w:val="0F172A"/>
+                <w:sz w:val="16"/>
+              </w:rPr>
+              <w:t>5. 썸네일 제작 후 PNG 다운로드</w:t>
+            </w:r>
+          </w:p>
+          <w:p>
+            <w:r>
+              <w:rPr>
+                <w:rFonts w:ascii="Courier New" w:hAnsi="Courier New" w:eastAsia="Noto Sans KR"/>
+                <w:color w:val="0F172A"/>
+                <w:sz w:val="16"/>
+              </w:rPr>
+              <w:t>6. 이미지/PDF 워터마크 적용</w:t>
+            </w:r>
+          </w:p>
+          <w:p>
+            <w:r>
+              <w:rPr>
+                <w:rFonts w:ascii="Courier New" w:hAnsi="Courier New" w:eastAsia="Noto Sans KR"/>
+                <w:color w:val="0F172A"/>
+                <w:sz w:val="16"/>
+              </w:rPr>
+              <w:t>7. 레퍼런스 글 저장 후 새 글 생성에 반영</w:t>
+            </w:r>
+          </w:p>
+          <w:p>
+            <w:r>
+              <w:rPr>
+                <w:rFonts w:ascii="Courier New" w:hAnsi="Courier New" w:eastAsia="Noto Sans KR"/>
+                <w:color w:val="0F172A"/>
+                <w:sz w:val="16"/>
+              </w:rPr>
+              <w:t>8. GitHub push 후 Streamlit Cloud 배포 확인</w:t>
+            </w:r>
+          </w:p>
+          <w:p>
+            <w:r>
+              <w:rPr>
+                <w:rFonts w:ascii="Courier New" w:hAnsi="Courier New" w:eastAsia="Noto Sans KR"/>
+                <w:color w:val="0F172A"/>
+                <w:sz w:val="16"/>
+              </w:rPr>
+            </w:r>
+          </w:p>
+          <w:p>
+            <w:r>
+              <w:rPr>
+                <w:rFonts w:ascii="Courier New" w:hAnsi="Courier New" w:eastAsia="Noto Sans KR"/>
+                <w:color w:val="0F172A"/>
+                <w:sz w:val="16"/>
+              </w:rPr>
+              <w:t>결과는 테스트 ID, 입력, 기대 결과, 실제 결과, 수정 필요 여부 표로 정리해줘.</w:t>
+            </w:r>
+          </w:p>
+        </w:tc>
+      </w:tr>
+    </w:tbl>
+    <w:p/>
     <w:sectPr>
       <w:pgSz w:w="12240" w:h="15840"/>
-      <w:pgMar w:top="1008" w:right="936" w:bottom="1008" w:left="936" w:header="720" w:footer="720" w:gutter="0"/>
+      <w:pgMar w:top="1037" w:right="1037" w:bottom="1037" w:left="1037" w:header="720" w:footer="720" w:gutter="0"/>
       <w:cols w:space="720"/>
       <w:docGrid w:linePitch="360"/>
     </w:sectPr>
@@ -632,8 +3328,8 @@
     <w:qFormat/>
     <w:rsid w:val="00FC693F"/>
     <w:rPr>
-      <w:rFonts w:ascii="Arial" w:hAnsi="Arial" w:eastAsia="맑은 고딕"/>
-      <w:sz w:val="19"/>
+      <w:rFonts w:ascii="Arial" w:hAnsi="Arial" w:eastAsia="Noto Sans KR"/>
+      <w:sz w:val="20"/>
     </w:rPr>
   </w:style>
   <w:style w:type="paragraph" w:styleId="Header">
@@ -695,7 +3391,7 @@
       <w:outlineLvl w:val="0"/>
     </w:pPr>
     <w:rPr>
-      <w:rFonts w:asciiTheme="majorHAnsi" w:eastAsiaTheme="majorEastAsia" w:hAnsiTheme="majorHAnsi" w:cstheme="majorBidi" w:ascii="Arial" w:hAnsi="Arial" w:eastAsia="맑은 고딕"/>
+      <w:rFonts w:asciiTheme="majorHAnsi" w:eastAsiaTheme="majorEastAsia" w:hAnsiTheme="majorHAnsi" w:cstheme="majorBidi" w:ascii="Arial" w:hAnsi="Arial" w:eastAsia="Noto Sans KR"/>
       <w:b/>
       <w:bCs/>
       <w:color w:val="0F766E"/>
@@ -719,11 +3415,11 @@
       <w:outlineLvl w:val="1"/>
     </w:pPr>
     <w:rPr>
-      <w:rFonts w:asciiTheme="majorHAnsi" w:eastAsiaTheme="majorEastAsia" w:hAnsiTheme="majorHAnsi" w:cstheme="majorBidi" w:ascii="Arial" w:hAnsi="Arial" w:eastAsia="맑은 고딕"/>
+      <w:rFonts w:asciiTheme="majorHAnsi" w:eastAsiaTheme="majorEastAsia" w:hAnsiTheme="majorHAnsi" w:cstheme="majorBidi" w:ascii="Arial" w:hAnsi="Arial" w:eastAsia="Noto Sans KR"/>
       <w:b/>
       <w:bCs/>
-      <w:color w:val="4F81BD" w:themeColor="accent1"/>
-      <w:sz w:val="24"/>
+      <w:color w:val="1E40AF"/>
+      <w:sz w:val="26"/>
       <w:szCs w:val="26"/>
     </w:rPr>
   </w:style>
@@ -743,7 +3439,7 @@
       <w:outlineLvl w:val="2"/>
     </w:pPr>
     <w:rPr>
-      <w:rFonts w:asciiTheme="majorHAnsi" w:eastAsiaTheme="majorEastAsia" w:hAnsiTheme="majorHAnsi" w:cstheme="majorBidi" w:ascii="Arial" w:hAnsi="Arial" w:eastAsia="맑은 고딕"/>
+      <w:rFonts w:asciiTheme="majorHAnsi" w:eastAsiaTheme="majorEastAsia" w:hAnsiTheme="majorHAnsi" w:cstheme="majorBidi"/>
       <w:b/>
       <w:bCs/>
       <w:color w:val="4F81BD" w:themeColor="accent1"/>
@@ -984,11 +3680,12 @@
       <w:contextualSpacing/>
     </w:pPr>
     <w:rPr>
-      <w:rFonts w:asciiTheme="majorHAnsi" w:eastAsiaTheme="majorEastAsia" w:hAnsiTheme="majorHAnsi" w:cstheme="majorBidi" w:ascii="Arial" w:hAnsi="Arial" w:eastAsia="맑은 고딕"/>
-      <w:color w:val="17365D" w:themeColor="text2" w:themeShade="BF"/>
+      <w:rFonts w:asciiTheme="majorHAnsi" w:eastAsiaTheme="majorEastAsia" w:hAnsiTheme="majorHAnsi" w:cstheme="majorBidi" w:ascii="Arial" w:hAnsi="Arial" w:eastAsia="Noto Sans KR"/>
+      <w:b/>
+      <w:color w:val="111827"/>
       <w:spacing w:val="5"/>
       <w:kern w:val="28"/>
-      <w:sz w:val="52"/>
+      <w:sz w:val="40"/>
       <w:szCs w:val="52"/>
     </w:rPr>
   </w:style>

</xml_diff>